<commit_message>
Added Java file used in some of the functions.
Got rid of SAVF becasue it was to big for GitHub.
</commit_message>
<xml_diff>
--- a/APLLIB Documentation/APLLIB commands.docx
+++ b/APLLIB Documentation/APLLIB commands.docx
@@ -36,28 +36,305 @@
     </w:p>
     <w:p>
       <w:pPr>
-        <w:pStyle w:val="Title"/>
+        <w:pStyle w:val="Heading1"/>
       </w:pPr>
       <w:bookmarkStart w:id="3" w:name="OLE_LINK14"/>
       <w:bookmarkStart w:id="4" w:name="OLE_LINK15"/>
       <w:r>
         <w:lastRenderedPageBreak/>
-        <w:t>ESM/DSM/CSM/PSM/SSM/MSM/LSM</w:t>
+        <w:t>Quick Source Member Options</w:t>
       </w:r>
     </w:p>
-    <w:p>
-      <w:r>
-        <w:t>Purpose: Edit/Display/Compile/Promote source members</w:t>
-      </w:r>
-    </w:p>
-    <w:p>
-      <w:r>
-        <w:t xml:space="preserve">Things to know:  </w:t>
-      </w:r>
-      <w:r>
-        <w:tab/>
-      </w:r>
-    </w:p>
+    <w:tbl>
+      <w:tblPr>
+        <w:tblStyle w:val="GridTable5Dark-Accent1"/>
+        <w:tblW w:w="0" w:type="auto"/>
+        <w:tblLook w:val="04A0" w:firstRow="1" w:lastRow="0" w:firstColumn="1" w:lastColumn="0" w:noHBand="0" w:noVBand="1"/>
+      </w:tblPr>
+      <w:tblGrid>
+        <w:gridCol w:w="2088"/>
+        <w:gridCol w:w="7020"/>
+        <w:gridCol w:w="1908"/>
+      </w:tblGrid>
+      <w:tr>
+        <w:trPr>
+          <w:cnfStyle w:val="100000000000" w:firstRow="1" w:lastRow="0" w:firstColumn="0" w:lastColumn="0" w:oddVBand="0" w:evenVBand="0" w:oddHBand="0" w:evenHBand="0" w:firstRowFirstColumn="0" w:firstRowLastColumn="0" w:lastRowFirstColumn="0" w:lastRowLastColumn="0"/>
+        </w:trPr>
+        <w:tc>
+          <w:tcPr>
+            <w:cnfStyle w:val="001000000000" w:firstRow="0" w:lastRow="0" w:firstColumn="1" w:lastColumn="0" w:oddVBand="0" w:evenVBand="0" w:oddHBand="0" w:evenHBand="0" w:firstRowFirstColumn="0" w:firstRowLastColumn="0" w:lastRowFirstColumn="0" w:lastRowLastColumn="0"/>
+            <w:tcW w:w="2088" w:type="dxa"/>
+          </w:tcPr>
+          <w:p>
+            <w:r>
+              <w:rPr>
+                <w:sz w:val="24"/>
+              </w:rPr>
+              <w:t>Command</w:t>
+            </w:r>
+          </w:p>
+        </w:tc>
+        <w:tc>
+          <w:tcPr>
+            <w:tcW w:w="7020" w:type="dxa"/>
+          </w:tcPr>
+          <w:p>
+            <w:pPr>
+              <w:cnfStyle w:val="100000000000" w:firstRow="1" w:lastRow="0" w:firstColumn="0" w:lastColumn="0" w:oddVBand="0" w:evenVBand="0" w:oddHBand="0" w:evenHBand="0" w:firstRowFirstColumn="0" w:firstRowLastColumn="0" w:lastRowFirstColumn="0" w:lastRowLastColumn="0"/>
+            </w:pPr>
+            <w:r>
+              <w:t>Description</w:t>
+            </w:r>
+          </w:p>
+        </w:tc>
+        <w:tc>
+          <w:tcPr>
+            <w:tcW w:w="1908" w:type="dxa"/>
+          </w:tcPr>
+          <w:p>
+            <w:pPr>
+              <w:cnfStyle w:val="100000000000" w:firstRow="1" w:lastRow="0" w:firstColumn="0" w:lastColumn="0" w:oddVBand="0" w:evenVBand="0" w:oddHBand="0" w:evenHBand="0" w:firstRowFirstColumn="0" w:firstRowLastColumn="0" w:lastRowFirstColumn="0" w:lastRowLastColumn="0"/>
+            </w:pPr>
+            <w:r>
+              <w:t>Status</w:t>
+            </w:r>
+          </w:p>
+        </w:tc>
+      </w:tr>
+      <w:tr>
+        <w:trPr>
+          <w:cnfStyle w:val="000000100000" w:firstRow="0" w:lastRow="0" w:firstColumn="0" w:lastColumn="0" w:oddVBand="0" w:evenVBand="0" w:oddHBand="1" w:evenHBand="0" w:firstRowFirstColumn="0" w:firstRowLastColumn="0" w:lastRowFirstColumn="0" w:lastRowLastColumn="0"/>
+        </w:trPr>
+        <w:tc>
+          <w:tcPr>
+            <w:cnfStyle w:val="001000000000" w:firstRow="0" w:lastRow="0" w:firstColumn="1" w:lastColumn="0" w:oddVBand="0" w:evenVBand="0" w:oddHBand="0" w:evenHBand="0" w:firstRowFirstColumn="0" w:firstRowLastColumn="0" w:lastRowFirstColumn="0" w:lastRowLastColumn="0"/>
+            <w:tcW w:w="2088" w:type="dxa"/>
+          </w:tcPr>
+          <w:p>
+            <w:r>
+              <w:t>DSM</w:t>
+            </w:r>
+          </w:p>
+        </w:tc>
+        <w:tc>
+          <w:tcPr>
+            <w:tcW w:w="7020" w:type="dxa"/>
+          </w:tcPr>
+          <w:p>
+            <w:pPr>
+              <w:cnfStyle w:val="000000100000" w:firstRow="0" w:lastRow="0" w:firstColumn="0" w:lastColumn="0" w:oddVBand="0" w:evenVBand="0" w:oddHBand="1" w:evenHBand="0" w:firstRowFirstColumn="0" w:firstRowLastColumn="0" w:lastRowFirstColumn="0" w:lastRowLastColumn="0"/>
+            </w:pPr>
+            <w:r>
+              <w:t>Display Source Member</w:t>
+            </w:r>
+          </w:p>
+        </w:tc>
+        <w:tc>
+          <w:tcPr>
+            <w:tcW w:w="1908" w:type="dxa"/>
+          </w:tcPr>
+          <w:p>
+            <w:pPr>
+              <w:cnfStyle w:val="000000100000" w:firstRow="0" w:lastRow="0" w:firstColumn="0" w:lastColumn="0" w:oddVBand="0" w:evenVBand="0" w:oddHBand="1" w:evenHBand="0" w:firstRowFirstColumn="0" w:firstRowLastColumn="0" w:lastRowFirstColumn="0" w:lastRowLastColumn="0"/>
+            </w:pPr>
+          </w:p>
+        </w:tc>
+      </w:tr>
+      <w:tr>
+        <w:tc>
+          <w:tcPr>
+            <w:cnfStyle w:val="001000000000" w:firstRow="0" w:lastRow="0" w:firstColumn="1" w:lastColumn="0" w:oddVBand="0" w:evenVBand="0" w:oddHBand="0" w:evenHBand="0" w:firstRowFirstColumn="0" w:firstRowLastColumn="0" w:lastRowFirstColumn="0" w:lastRowLastColumn="0"/>
+            <w:tcW w:w="2088" w:type="dxa"/>
+          </w:tcPr>
+          <w:p>
+            <w:r>
+              <w:t>ESM</w:t>
+            </w:r>
+          </w:p>
+        </w:tc>
+        <w:tc>
+          <w:tcPr>
+            <w:tcW w:w="7020" w:type="dxa"/>
+          </w:tcPr>
+          <w:p>
+            <w:pPr>
+              <w:cnfStyle w:val="000000000000" w:firstRow="0" w:lastRow="0" w:firstColumn="0" w:lastColumn="0" w:oddVBand="0" w:evenVBand="0" w:oddHBand="0" w:evenHBand="0" w:firstRowFirstColumn="0" w:firstRowLastColumn="0" w:lastRowFirstColumn="0" w:lastRowLastColumn="0"/>
+            </w:pPr>
+            <w:r>
+              <w:t>Edit Source Member</w:t>
+            </w:r>
+          </w:p>
+        </w:tc>
+        <w:tc>
+          <w:tcPr>
+            <w:tcW w:w="1908" w:type="dxa"/>
+          </w:tcPr>
+          <w:p>
+            <w:pPr>
+              <w:cnfStyle w:val="000000000000" w:firstRow="0" w:lastRow="0" w:firstColumn="0" w:lastColumn="0" w:oddVBand="0" w:evenVBand="0" w:oddHBand="0" w:evenHBand="0" w:firstRowFirstColumn="0" w:firstRowLastColumn="0" w:lastRowFirstColumn="0" w:lastRowLastColumn="0"/>
+            </w:pPr>
+          </w:p>
+        </w:tc>
+      </w:tr>
+      <w:tr>
+        <w:trPr>
+          <w:cnfStyle w:val="000000100000" w:firstRow="0" w:lastRow="0" w:firstColumn="0" w:lastColumn="0" w:oddVBand="0" w:evenVBand="0" w:oddHBand="1" w:evenHBand="0" w:firstRowFirstColumn="0" w:firstRowLastColumn="0" w:lastRowFirstColumn="0" w:lastRowLastColumn="0"/>
+        </w:trPr>
+        <w:tc>
+          <w:tcPr>
+            <w:cnfStyle w:val="001000000000" w:firstRow="0" w:lastRow="0" w:firstColumn="1" w:lastColumn="0" w:oddVBand="0" w:evenVBand="0" w:oddHBand="0" w:evenHBand="0" w:firstRowFirstColumn="0" w:firstRowLastColumn="0" w:lastRowFirstColumn="0" w:lastRowLastColumn="0"/>
+            <w:tcW w:w="2088" w:type="dxa"/>
+          </w:tcPr>
+          <w:p>
+            <w:r>
+              <w:t>CSM</w:t>
+            </w:r>
+          </w:p>
+        </w:tc>
+        <w:tc>
+          <w:tcPr>
+            <w:tcW w:w="7020" w:type="dxa"/>
+          </w:tcPr>
+          <w:p>
+            <w:pPr>
+              <w:cnfStyle w:val="000000100000" w:firstRow="0" w:lastRow="0" w:firstColumn="0" w:lastColumn="0" w:oddVBand="0" w:evenVBand="0" w:oddHBand="1" w:evenHBand="0" w:firstRowFirstColumn="0" w:firstRowLastColumn="0" w:lastRowFirstColumn="0" w:lastRowLastColumn="0"/>
+            </w:pPr>
+            <w:r>
+              <w:t>Compile Source Member</w:t>
+            </w:r>
+          </w:p>
+        </w:tc>
+        <w:tc>
+          <w:tcPr>
+            <w:tcW w:w="1908" w:type="dxa"/>
+          </w:tcPr>
+          <w:p>
+            <w:pPr>
+              <w:cnfStyle w:val="000000100000" w:firstRow="0" w:lastRow="0" w:firstColumn="0" w:lastColumn="0" w:oddVBand="0" w:evenVBand="0" w:oddHBand="1" w:evenHBand="0" w:firstRowFirstColumn="0" w:firstRowLastColumn="0" w:lastRowFirstColumn="0" w:lastRowLastColumn="0"/>
+            </w:pPr>
+            <w:r>
+              <w:t>TODO</w:t>
+            </w:r>
+          </w:p>
+        </w:tc>
+      </w:tr>
+      <w:tr>
+        <w:tc>
+          <w:tcPr>
+            <w:cnfStyle w:val="001000000000" w:firstRow="0" w:lastRow="0" w:firstColumn="1" w:lastColumn="0" w:oddVBand="0" w:evenVBand="0" w:oddHBand="0" w:evenHBand="0" w:firstRowFirstColumn="0" w:firstRowLastColumn="0" w:lastRowFirstColumn="0" w:lastRowLastColumn="0"/>
+            <w:tcW w:w="2088" w:type="dxa"/>
+          </w:tcPr>
+          <w:p>
+            <w:r>
+              <w:t>SSM</w:t>
+            </w:r>
+          </w:p>
+        </w:tc>
+        <w:tc>
+          <w:tcPr>
+            <w:tcW w:w="7020" w:type="dxa"/>
+          </w:tcPr>
+          <w:p>
+            <w:pPr>
+              <w:cnfStyle w:val="000000000000" w:firstRow="0" w:lastRow="0" w:firstColumn="0" w:lastColumn="0" w:oddVBand="0" w:evenVBand="0" w:oddHBand="0" w:evenHBand="0" w:firstRowFirstColumn="0" w:firstRowLastColumn="0" w:lastRowFirstColumn="0" w:lastRowLastColumn="0"/>
+            </w:pPr>
+            <w:proofErr w:type="gramStart"/>
+            <w:r>
+              <w:t>Open Source</w:t>
+            </w:r>
+            <w:proofErr w:type="gramEnd"/>
+            <w:r>
+              <w:t xml:space="preserve"> Member in SDA</w:t>
+            </w:r>
+          </w:p>
+        </w:tc>
+        <w:tc>
+          <w:tcPr>
+            <w:tcW w:w="1908" w:type="dxa"/>
+          </w:tcPr>
+          <w:p>
+            <w:pPr>
+              <w:cnfStyle w:val="000000000000" w:firstRow="0" w:lastRow="0" w:firstColumn="0" w:lastColumn="0" w:oddVBand="0" w:evenVBand="0" w:oddHBand="0" w:evenHBand="0" w:firstRowFirstColumn="0" w:firstRowLastColumn="0" w:lastRowFirstColumn="0" w:lastRowLastColumn="0"/>
+            </w:pPr>
+          </w:p>
+        </w:tc>
+      </w:tr>
+      <w:tr>
+        <w:trPr>
+          <w:cnfStyle w:val="000000100000" w:firstRow="0" w:lastRow="0" w:firstColumn="0" w:lastColumn="0" w:oddVBand="0" w:evenVBand="0" w:oddHBand="1" w:evenHBand="0" w:firstRowFirstColumn="0" w:firstRowLastColumn="0" w:lastRowFirstColumn="0" w:lastRowLastColumn="0"/>
+        </w:trPr>
+        <w:tc>
+          <w:tcPr>
+            <w:cnfStyle w:val="001000000000" w:firstRow="0" w:lastRow="0" w:firstColumn="1" w:lastColumn="0" w:oddVBand="0" w:evenVBand="0" w:oddHBand="0" w:evenHBand="0" w:firstRowFirstColumn="0" w:firstRowLastColumn="0" w:lastRowFirstColumn="0" w:lastRowLastColumn="0"/>
+            <w:tcW w:w="2088" w:type="dxa"/>
+          </w:tcPr>
+          <w:p>
+            <w:r>
+              <w:t>LSM</w:t>
+            </w:r>
+          </w:p>
+        </w:tc>
+        <w:tc>
+          <w:tcPr>
+            <w:tcW w:w="7020" w:type="dxa"/>
+          </w:tcPr>
+          <w:p>
+            <w:pPr>
+              <w:cnfStyle w:val="000000100000" w:firstRow="0" w:lastRow="0" w:firstColumn="0" w:lastColumn="0" w:oddVBand="0" w:evenVBand="0" w:oddHBand="1" w:evenHBand="0" w:firstRowFirstColumn="0" w:firstRowLastColumn="0" w:lastRowFirstColumn="0" w:lastRowLastColumn="0"/>
+            </w:pPr>
+            <w:r>
+              <w:t>Add level to a Source Member</w:t>
+            </w:r>
+          </w:p>
+        </w:tc>
+        <w:tc>
+          <w:tcPr>
+            <w:tcW w:w="1908" w:type="dxa"/>
+          </w:tcPr>
+          <w:p>
+            <w:pPr>
+              <w:cnfStyle w:val="000000100000" w:firstRow="0" w:lastRow="0" w:firstColumn="0" w:lastColumn="0" w:oddVBand="0" w:evenVBand="0" w:oddHBand="1" w:evenHBand="0" w:firstRowFirstColumn="0" w:firstRowLastColumn="0" w:lastRowFirstColumn="0" w:lastRowLastColumn="0"/>
+            </w:pPr>
+          </w:p>
+        </w:tc>
+      </w:tr>
+      <w:tr>
+        <w:tc>
+          <w:tcPr>
+            <w:cnfStyle w:val="001000000000" w:firstRow="0" w:lastRow="0" w:firstColumn="1" w:lastColumn="0" w:oddVBand="0" w:evenVBand="0" w:oddHBand="0" w:evenHBand="0" w:firstRowFirstColumn="0" w:firstRowLastColumn="0" w:lastRowFirstColumn="0" w:lastRowLastColumn="0"/>
+            <w:tcW w:w="2088" w:type="dxa"/>
+          </w:tcPr>
+          <w:p>
+            <w:r>
+              <w:t>MSM</w:t>
+            </w:r>
+          </w:p>
+        </w:tc>
+        <w:tc>
+          <w:tcPr>
+            <w:tcW w:w="7020" w:type="dxa"/>
+          </w:tcPr>
+          <w:p>
+            <w:pPr>
+              <w:cnfStyle w:val="000000000000" w:firstRow="0" w:lastRow="0" w:firstColumn="0" w:lastColumn="0" w:oddVBand="0" w:evenVBand="0" w:oddHBand="0" w:evenHBand="0" w:firstRowFirstColumn="0" w:firstRowLastColumn="0" w:lastRowFirstColumn="0" w:lastRowLastColumn="0"/>
+            </w:pPr>
+            <w:r>
+              <w:t>Move Source Member</w:t>
+            </w:r>
+          </w:p>
+        </w:tc>
+        <w:tc>
+          <w:tcPr>
+            <w:tcW w:w="1908" w:type="dxa"/>
+          </w:tcPr>
+          <w:p>
+            <w:pPr>
+              <w:cnfStyle w:val="000000000000" w:firstRow="0" w:lastRow="0" w:firstColumn="0" w:lastColumn="0" w:oddVBand="0" w:evenVBand="0" w:oddHBand="0" w:evenHBand="0" w:firstRowFirstColumn="0" w:firstRowLastColumn="0" w:lastRowFirstColumn="0" w:lastRowLastColumn="0"/>
+            </w:pPr>
+          </w:p>
+        </w:tc>
+      </w:tr>
+    </w:tbl>
     <w:bookmarkEnd w:id="3"/>
     <w:bookmarkEnd w:id="4"/>
     <w:p>
@@ -87,37 +364,43 @@
         <w:t>CSM</w:t>
       </w:r>
       <w:r>
-        <w:t xml:space="preserve"> will prompt up the correct </w:t>
-      </w:r>
-      <w:proofErr w:type="spellStart"/>
-      <w:r>
-        <w:t>CRTxxxxxx</w:t>
-      </w:r>
-      <w:proofErr w:type="spellEnd"/>
-      <w:r>
-        <w:t xml:space="preserve"> command along with the correct source file and library. It will attempt to find the correct source </w:t>
-      </w:r>
-      <w:proofErr w:type="gramStart"/>
-      <w:r>
-        <w:t>similar to</w:t>
-      </w:r>
-      <w:proofErr w:type="gramEnd"/>
-      <w:r>
-        <w:t xml:space="preserve"> ESM/DSM. You can compile in batch or interactive</w:t>
-      </w:r>
-      <w:r>
-        <w:t xml:space="preserve"> or submit the compile to the night queue</w:t>
-      </w:r>
-      <w:r>
-        <w:t>.</w:t>
-      </w:r>
-    </w:p>
-    <w:p>
-      <w:r>
         <w:rPr>
           <w:b/>
         </w:rPr>
-        <w:t>PSM</w:t>
+        <w:t xml:space="preserve"> -TODO, need to recreate</w:t>
+      </w:r>
+      <w:r>
+        <w:t xml:space="preserve"> will prompt up the correct </w:t>
+      </w:r>
+      <w:proofErr w:type="spellStart"/>
+      <w:r>
+        <w:t>CRTxxxxxx</w:t>
+      </w:r>
+      <w:proofErr w:type="spellEnd"/>
+      <w:r>
+        <w:t xml:space="preserve"> command along with the correct source file and library. It will attempt to find the correct source </w:t>
+      </w:r>
+      <w:proofErr w:type="gramStart"/>
+      <w:r>
+        <w:t>similar to</w:t>
+      </w:r>
+      <w:proofErr w:type="gramEnd"/>
+      <w:r>
+        <w:t xml:space="preserve"> ESM/DSM. You can compile in batch or interactive</w:t>
+      </w:r>
+      <w:r>
+        <w:t xml:space="preserve"> or submit the compile to the night queue</w:t>
+      </w:r>
+      <w:r>
+        <w:t>.</w:t>
+      </w:r>
+    </w:p>
+    <w:p>
+      <w:r>
+        <w:rPr>
+          <w:b/>
+        </w:rPr>
+        <w:t>SSM</w:t>
       </w:r>
       <w:r>
         <w:rPr>
@@ -126,79 +409,6 @@
         <w:t xml:space="preserve"> </w:t>
       </w:r>
       <w:r>
-        <w:t xml:space="preserve">will promote the source in or out based on whether it can find it in the programmer’s library. </w:t>
-      </w:r>
-      <w:r>
-        <w:t>When promoting source in, y</w:t>
-      </w:r>
-      <w:r>
-        <w:t xml:space="preserve">ou have the option to send compiles to the night queue, compile interactive, compile in batch or don’t compile at all. When promoting source in, if you specify the RPGLE or CL source first it will promote in the display file first then the RPGLE/CL source. </w:t>
-      </w:r>
-      <w:r>
-        <w:t>Promoting in will automatically clear the IF levels (B</w:t>
-      </w:r>
-      <w:proofErr w:type="gramStart"/>
-      <w:r>
-        <w:t>001,E</w:t>
-      </w:r>
-      <w:proofErr w:type="gramEnd"/>
-      <w:r>
-        <w:t xml:space="preserve">001 found on the left) and </w:t>
-      </w:r>
-      <w:proofErr w:type="gramStart"/>
-      <w:r>
-        <w:t>Promoting</w:t>
-      </w:r>
-      <w:proofErr w:type="gramEnd"/>
-      <w:r>
-        <w:t xml:space="preserve"> out will automatically insert the IF levels.</w:t>
-      </w:r>
-      <w:r>
-        <w:t xml:space="preserve"> If the program is new, it will first add the program/DDS to SMAC. You can also cancel the promotion of a source member by specifying *CANCEL in the COMPILE field. This will </w:t>
-      </w:r>
-      <w:proofErr w:type="gramStart"/>
-      <w:r>
-        <w:t>remove</w:t>
-      </w:r>
-      <w:proofErr w:type="gramEnd"/>
-      <w:r>
-        <w:t xml:space="preserve"> from your library and cancel the promotion.</w:t>
-      </w:r>
-    </w:p>
-    <w:p>
-      <w:r>
-        <w:tab/>
-        <w:t>Note: One caveat. If you have forgotten that you have previously promoted out a source member and use the PSM command</w:t>
-      </w:r>
-      <w:r>
-        <w:tab/>
-      </w:r>
-      <w:r>
-        <w:t xml:space="preserve"> again, it </w:t>
-      </w:r>
-      <w:proofErr w:type="gramStart"/>
-      <w:r>
-        <w:t>attempt</w:t>
-      </w:r>
-      <w:proofErr w:type="gramEnd"/>
-      <w:r>
-        <w:t xml:space="preserve"> to promote the source back in. </w:t>
-      </w:r>
-    </w:p>
-    <w:p>
-      <w:r>
-        <w:rPr>
-          <w:b/>
-        </w:rPr>
-        <w:t>SSM</w:t>
-      </w:r>
-      <w:r>
-        <w:rPr>
-          <w:b/>
-        </w:rPr>
-        <w:t xml:space="preserve"> </w:t>
-      </w:r>
-      <w:r>
         <w:t>will change a display file member using SDA. If you put a program name (</w:t>
       </w:r>
       <w:proofErr w:type="spellStart"/>
@@ -248,423 +458,1082 @@
     </w:p>
     <w:p>
       <w:pPr>
-        <w:rPr>
-          <w:sz w:val="28"/>
-          <w:szCs w:val="28"/>
-        </w:rPr>
-      </w:pPr>
-      <w:r>
-        <w:rPr>
-          <w:sz w:val="28"/>
-          <w:szCs w:val="28"/>
-        </w:rPr>
-        <w:br w:type="page"/>
-      </w:r>
-      <w:r>
-        <w:rPr>
-          <w:sz w:val="56"/>
-          <w:szCs w:val="56"/>
-        </w:rPr>
-        <w:lastRenderedPageBreak/>
-        <w:t>RJ/RSTJRN</w:t>
+        <w:pStyle w:val="Heading1"/>
+      </w:pPr>
+      <w:r>
+        <w:t>Commands for use in CL Programs</w:t>
+      </w:r>
+    </w:p>
+    <w:tbl>
+      <w:tblPr>
+        <w:tblStyle w:val="GridTable5Dark-Accent1"/>
+        <w:tblW w:w="0" w:type="auto"/>
+        <w:tblLook w:val="04A0" w:firstRow="1" w:lastRow="0" w:firstColumn="1" w:lastColumn="0" w:noHBand="0" w:noVBand="1"/>
+      </w:tblPr>
+      <w:tblGrid>
+        <w:gridCol w:w="2088"/>
+        <w:gridCol w:w="7020"/>
+        <w:gridCol w:w="1908"/>
+      </w:tblGrid>
+      <w:tr>
+        <w:trPr>
+          <w:cnfStyle w:val="100000000000" w:firstRow="1" w:lastRow="0" w:firstColumn="0" w:lastColumn="0" w:oddVBand="0" w:evenVBand="0" w:oddHBand="0" w:evenHBand="0" w:firstRowFirstColumn="0" w:firstRowLastColumn="0" w:lastRowFirstColumn="0" w:lastRowLastColumn="0"/>
+        </w:trPr>
+        <w:tc>
+          <w:tcPr>
+            <w:cnfStyle w:val="001000000000" w:firstRow="0" w:lastRow="0" w:firstColumn="1" w:lastColumn="0" w:oddVBand="0" w:evenVBand="0" w:oddHBand="0" w:evenHBand="0" w:firstRowFirstColumn="0" w:firstRowLastColumn="0" w:lastRowFirstColumn="0" w:lastRowLastColumn="0"/>
+            <w:tcW w:w="2088" w:type="dxa"/>
+          </w:tcPr>
+          <w:p>
+            <w:r>
+              <w:rPr>
+                <w:sz w:val="24"/>
+              </w:rPr>
+              <w:t>Command</w:t>
+            </w:r>
+          </w:p>
+        </w:tc>
+        <w:tc>
+          <w:tcPr>
+            <w:tcW w:w="7020" w:type="dxa"/>
+          </w:tcPr>
+          <w:p>
+            <w:pPr>
+              <w:cnfStyle w:val="100000000000" w:firstRow="1" w:lastRow="0" w:firstColumn="0" w:lastColumn="0" w:oddVBand="0" w:evenVBand="0" w:oddHBand="0" w:evenHBand="0" w:firstRowFirstColumn="0" w:firstRowLastColumn="0" w:lastRowFirstColumn="0" w:lastRowLastColumn="0"/>
+            </w:pPr>
+            <w:r>
+              <w:t>Description</w:t>
+            </w:r>
+          </w:p>
+        </w:tc>
+        <w:tc>
+          <w:tcPr>
+            <w:tcW w:w="1908" w:type="dxa"/>
+          </w:tcPr>
+          <w:p>
+            <w:pPr>
+              <w:cnfStyle w:val="100000000000" w:firstRow="1" w:lastRow="0" w:firstColumn="0" w:lastColumn="0" w:oddVBand="0" w:evenVBand="0" w:oddHBand="0" w:evenHBand="0" w:firstRowFirstColumn="0" w:firstRowLastColumn="0" w:lastRowFirstColumn="0" w:lastRowLastColumn="0"/>
+            </w:pPr>
+            <w:r>
+              <w:t>Status</w:t>
+            </w:r>
+          </w:p>
+        </w:tc>
+      </w:tr>
+      <w:tr>
+        <w:trPr>
+          <w:cnfStyle w:val="000000100000" w:firstRow="0" w:lastRow="0" w:firstColumn="0" w:lastColumn="0" w:oddVBand="0" w:evenVBand="0" w:oddHBand="1" w:evenHBand="0" w:firstRowFirstColumn="0" w:firstRowLastColumn="0" w:lastRowFirstColumn="0" w:lastRowLastColumn="0"/>
+        </w:trPr>
+        <w:tc>
+          <w:tcPr>
+            <w:cnfStyle w:val="001000000000" w:firstRow="0" w:lastRow="0" w:firstColumn="1" w:lastColumn="0" w:oddVBand="0" w:evenVBand="0" w:oddHBand="0" w:evenHBand="0" w:firstRowFirstColumn="0" w:firstRowLastColumn="0" w:lastRowFirstColumn="0" w:lastRowLastColumn="0"/>
+            <w:tcW w:w="2088" w:type="dxa"/>
+          </w:tcPr>
+          <w:p>
+            <w:r>
+              <w:t>GETDTE</w:t>
+            </w:r>
+          </w:p>
+        </w:tc>
+        <w:tc>
+          <w:tcPr>
+            <w:tcW w:w="7020" w:type="dxa"/>
+          </w:tcPr>
+          <w:p>
+            <w:pPr>
+              <w:cnfStyle w:val="000000100000" w:firstRow="0" w:lastRow="0" w:firstColumn="0" w:lastColumn="0" w:oddVBand="0" w:evenVBand="0" w:oddHBand="1" w:evenHBand="0" w:firstRowFirstColumn="0" w:firstRowLastColumn="0" w:lastRowFirstColumn="0" w:lastRowLastColumn="0"/>
+            </w:pPr>
+            <w:r>
+              <w:t>Returns the date in many different formats, also allows a little date math</w:t>
+            </w:r>
+          </w:p>
+        </w:tc>
+        <w:tc>
+          <w:tcPr>
+            <w:tcW w:w="1908" w:type="dxa"/>
+          </w:tcPr>
+          <w:p>
+            <w:pPr>
+              <w:cnfStyle w:val="000000100000" w:firstRow="0" w:lastRow="0" w:firstColumn="0" w:lastColumn="0" w:oddVBand="0" w:evenVBand="0" w:oddHBand="1" w:evenHBand="0" w:firstRowFirstColumn="0" w:firstRowLastColumn="0" w:lastRowFirstColumn="0" w:lastRowLastColumn="0"/>
+            </w:pPr>
+          </w:p>
+        </w:tc>
+      </w:tr>
+      <w:tr>
+        <w:tc>
+          <w:tcPr>
+            <w:cnfStyle w:val="001000000000" w:firstRow="0" w:lastRow="0" w:firstColumn="1" w:lastColumn="0" w:oddVBand="0" w:evenVBand="0" w:oddHBand="0" w:evenHBand="0" w:firstRowFirstColumn="0" w:firstRowLastColumn="0" w:lastRowFirstColumn="0" w:lastRowLastColumn="0"/>
+            <w:tcW w:w="2088" w:type="dxa"/>
+          </w:tcPr>
+          <w:p>
+            <w:r>
+              <w:t>GETEML</w:t>
+            </w:r>
+          </w:p>
+        </w:tc>
+        <w:tc>
+          <w:tcPr>
+            <w:tcW w:w="7020" w:type="dxa"/>
+          </w:tcPr>
+          <w:p>
+            <w:pPr>
+              <w:cnfStyle w:val="000000000000" w:firstRow="0" w:lastRow="0" w:firstColumn="0" w:lastColumn="0" w:oddVBand="0" w:evenVBand="0" w:oddHBand="0" w:evenHBand="0" w:firstRowFirstColumn="0" w:firstRowLastColumn="0" w:lastRowFirstColumn="0" w:lastRowLastColumn="0"/>
+            </w:pPr>
+            <w:r>
+              <w:t>Get users email address</w:t>
+            </w:r>
+          </w:p>
+        </w:tc>
+        <w:tc>
+          <w:tcPr>
+            <w:tcW w:w="1908" w:type="dxa"/>
+          </w:tcPr>
+          <w:p>
+            <w:pPr>
+              <w:cnfStyle w:val="000000000000" w:firstRow="0" w:lastRow="0" w:firstColumn="0" w:lastColumn="0" w:oddVBand="0" w:evenVBand="0" w:oddHBand="0" w:evenHBand="0" w:firstRowFirstColumn="0" w:firstRowLastColumn="0" w:lastRowFirstColumn="0" w:lastRowLastColumn="0"/>
+            </w:pPr>
+            <w:r>
+              <w:t>Env Dependent</w:t>
+            </w:r>
+          </w:p>
+        </w:tc>
+      </w:tr>
+      <w:tr>
+        <w:trPr>
+          <w:cnfStyle w:val="000000100000" w:firstRow="0" w:lastRow="0" w:firstColumn="0" w:lastColumn="0" w:oddVBand="0" w:evenVBand="0" w:oddHBand="1" w:evenHBand="0" w:firstRowFirstColumn="0" w:firstRowLastColumn="0" w:lastRowFirstColumn="0" w:lastRowLastColumn="0"/>
+        </w:trPr>
+        <w:tc>
+          <w:tcPr>
+            <w:cnfStyle w:val="001000000000" w:firstRow="0" w:lastRow="0" w:firstColumn="1" w:lastColumn="0" w:oddVBand="0" w:evenVBand="0" w:oddHBand="0" w:evenHBand="0" w:firstRowFirstColumn="0" w:firstRowLastColumn="0" w:lastRowFirstColumn="0" w:lastRowLastColumn="0"/>
+            <w:tcW w:w="2088" w:type="dxa"/>
+          </w:tcPr>
+          <w:p/>
+        </w:tc>
+        <w:tc>
+          <w:tcPr>
+            <w:tcW w:w="7020" w:type="dxa"/>
+          </w:tcPr>
+          <w:p>
+            <w:pPr>
+              <w:cnfStyle w:val="000000100000" w:firstRow="0" w:lastRow="0" w:firstColumn="0" w:lastColumn="0" w:oddVBand="0" w:evenVBand="0" w:oddHBand="1" w:evenHBand="0" w:firstRowFirstColumn="0" w:firstRowLastColumn="0" w:lastRowFirstColumn="0" w:lastRowLastColumn="0"/>
+            </w:pPr>
+          </w:p>
+        </w:tc>
+        <w:tc>
+          <w:tcPr>
+            <w:tcW w:w="1908" w:type="dxa"/>
+          </w:tcPr>
+          <w:p>
+            <w:pPr>
+              <w:cnfStyle w:val="000000100000" w:firstRow="0" w:lastRow="0" w:firstColumn="0" w:lastColumn="0" w:oddVBand="0" w:evenVBand="0" w:oddHBand="1" w:evenHBand="0" w:firstRowFirstColumn="0" w:firstRowLastColumn="0" w:lastRowFirstColumn="0" w:lastRowLastColumn="0"/>
+            </w:pPr>
+          </w:p>
+        </w:tc>
+      </w:tr>
+      <w:tr>
+        <w:tc>
+          <w:tcPr>
+            <w:cnfStyle w:val="001000000000" w:firstRow="0" w:lastRow="0" w:firstColumn="1" w:lastColumn="0" w:oddVBand="0" w:evenVBand="0" w:oddHBand="0" w:evenHBand="0" w:firstRowFirstColumn="0" w:firstRowLastColumn="0" w:lastRowFirstColumn="0" w:lastRowLastColumn="0"/>
+            <w:tcW w:w="2088" w:type="dxa"/>
+          </w:tcPr>
+          <w:p/>
+        </w:tc>
+        <w:tc>
+          <w:tcPr>
+            <w:tcW w:w="7020" w:type="dxa"/>
+          </w:tcPr>
+          <w:p>
+            <w:pPr>
+              <w:cnfStyle w:val="000000000000" w:firstRow="0" w:lastRow="0" w:firstColumn="0" w:lastColumn="0" w:oddVBand="0" w:evenVBand="0" w:oddHBand="0" w:evenHBand="0" w:firstRowFirstColumn="0" w:firstRowLastColumn="0" w:lastRowFirstColumn="0" w:lastRowLastColumn="0"/>
+            </w:pPr>
+          </w:p>
+        </w:tc>
+        <w:tc>
+          <w:tcPr>
+            <w:tcW w:w="1908" w:type="dxa"/>
+          </w:tcPr>
+          <w:p>
+            <w:pPr>
+              <w:cnfStyle w:val="000000000000" w:firstRow="0" w:lastRow="0" w:firstColumn="0" w:lastColumn="0" w:oddVBand="0" w:evenVBand="0" w:oddHBand="0" w:evenHBand="0" w:firstRowFirstColumn="0" w:firstRowLastColumn="0" w:lastRowFirstColumn="0" w:lastRowLastColumn="0"/>
+            </w:pPr>
+          </w:p>
+        </w:tc>
+      </w:tr>
+      <w:tr>
+        <w:trPr>
+          <w:cnfStyle w:val="000000100000" w:firstRow="0" w:lastRow="0" w:firstColumn="0" w:lastColumn="0" w:oddVBand="0" w:evenVBand="0" w:oddHBand="1" w:evenHBand="0" w:firstRowFirstColumn="0" w:firstRowLastColumn="0" w:lastRowFirstColumn="0" w:lastRowLastColumn="0"/>
+        </w:trPr>
+        <w:tc>
+          <w:tcPr>
+            <w:cnfStyle w:val="001000000000" w:firstRow="0" w:lastRow="0" w:firstColumn="1" w:lastColumn="0" w:oddVBand="0" w:evenVBand="0" w:oddHBand="0" w:evenHBand="0" w:firstRowFirstColumn="0" w:firstRowLastColumn="0" w:lastRowFirstColumn="0" w:lastRowLastColumn="0"/>
+            <w:tcW w:w="2088" w:type="dxa"/>
+          </w:tcPr>
+          <w:p/>
+        </w:tc>
+        <w:tc>
+          <w:tcPr>
+            <w:tcW w:w="7020" w:type="dxa"/>
+          </w:tcPr>
+          <w:p>
+            <w:pPr>
+              <w:cnfStyle w:val="000000100000" w:firstRow="0" w:lastRow="0" w:firstColumn="0" w:lastColumn="0" w:oddVBand="0" w:evenVBand="0" w:oddHBand="1" w:evenHBand="0" w:firstRowFirstColumn="0" w:firstRowLastColumn="0" w:lastRowFirstColumn="0" w:lastRowLastColumn="0"/>
+            </w:pPr>
+          </w:p>
+        </w:tc>
+        <w:tc>
+          <w:tcPr>
+            <w:tcW w:w="1908" w:type="dxa"/>
+          </w:tcPr>
+          <w:p>
+            <w:pPr>
+              <w:cnfStyle w:val="000000100000" w:firstRow="0" w:lastRow="0" w:firstColumn="0" w:lastColumn="0" w:oddVBand="0" w:evenVBand="0" w:oddHBand="1" w:evenHBand="0" w:firstRowFirstColumn="0" w:firstRowLastColumn="0" w:lastRowFirstColumn="0" w:lastRowLastColumn="0"/>
+            </w:pPr>
+          </w:p>
+        </w:tc>
+      </w:tr>
+      <w:tr>
+        <w:tc>
+          <w:tcPr>
+            <w:cnfStyle w:val="001000000000" w:firstRow="0" w:lastRow="0" w:firstColumn="1" w:lastColumn="0" w:oddVBand="0" w:evenVBand="0" w:oddHBand="0" w:evenHBand="0" w:firstRowFirstColumn="0" w:firstRowLastColumn="0" w:lastRowFirstColumn="0" w:lastRowLastColumn="0"/>
+            <w:tcW w:w="2088" w:type="dxa"/>
+          </w:tcPr>
+          <w:p/>
+        </w:tc>
+        <w:tc>
+          <w:tcPr>
+            <w:tcW w:w="7020" w:type="dxa"/>
+          </w:tcPr>
+          <w:p>
+            <w:pPr>
+              <w:cnfStyle w:val="000000000000" w:firstRow="0" w:lastRow="0" w:firstColumn="0" w:lastColumn="0" w:oddVBand="0" w:evenVBand="0" w:oddHBand="0" w:evenHBand="0" w:firstRowFirstColumn="0" w:firstRowLastColumn="0" w:lastRowFirstColumn="0" w:lastRowLastColumn="0"/>
+            </w:pPr>
+          </w:p>
+        </w:tc>
+        <w:tc>
+          <w:tcPr>
+            <w:tcW w:w="1908" w:type="dxa"/>
+          </w:tcPr>
+          <w:p>
+            <w:pPr>
+              <w:cnfStyle w:val="000000000000" w:firstRow="0" w:lastRow="0" w:firstColumn="0" w:lastColumn="0" w:oddVBand="0" w:evenVBand="0" w:oddHBand="0" w:evenHBand="0" w:firstRowFirstColumn="0" w:firstRowLastColumn="0" w:lastRowFirstColumn="0" w:lastRowLastColumn="0"/>
+            </w:pPr>
+          </w:p>
+        </w:tc>
+      </w:tr>
+      <w:tr>
+        <w:trPr>
+          <w:cnfStyle w:val="000000100000" w:firstRow="0" w:lastRow="0" w:firstColumn="0" w:lastColumn="0" w:oddVBand="0" w:evenVBand="0" w:oddHBand="1" w:evenHBand="0" w:firstRowFirstColumn="0" w:firstRowLastColumn="0" w:lastRowFirstColumn="0" w:lastRowLastColumn="0"/>
+        </w:trPr>
+        <w:tc>
+          <w:tcPr>
+            <w:cnfStyle w:val="001000000000" w:firstRow="0" w:lastRow="0" w:firstColumn="1" w:lastColumn="0" w:oddVBand="0" w:evenVBand="0" w:oddHBand="0" w:evenHBand="0" w:firstRowFirstColumn="0" w:firstRowLastColumn="0" w:lastRowFirstColumn="0" w:lastRowLastColumn="0"/>
+            <w:tcW w:w="2088" w:type="dxa"/>
+          </w:tcPr>
+          <w:p/>
+        </w:tc>
+        <w:tc>
+          <w:tcPr>
+            <w:tcW w:w="7020" w:type="dxa"/>
+          </w:tcPr>
+          <w:p>
+            <w:pPr>
+              <w:cnfStyle w:val="000000100000" w:firstRow="0" w:lastRow="0" w:firstColumn="0" w:lastColumn="0" w:oddVBand="0" w:evenVBand="0" w:oddHBand="1" w:evenHBand="0" w:firstRowFirstColumn="0" w:firstRowLastColumn="0" w:lastRowFirstColumn="0" w:lastRowLastColumn="0"/>
+            </w:pPr>
+          </w:p>
+        </w:tc>
+        <w:tc>
+          <w:tcPr>
+            <w:tcW w:w="1908" w:type="dxa"/>
+          </w:tcPr>
+          <w:p>
+            <w:pPr>
+              <w:cnfStyle w:val="000000100000" w:firstRow="0" w:lastRow="0" w:firstColumn="0" w:lastColumn="0" w:oddVBand="0" w:evenVBand="0" w:oddHBand="1" w:evenHBand="0" w:firstRowFirstColumn="0" w:firstRowLastColumn="0" w:lastRowFirstColumn="0" w:lastRowLastColumn="0"/>
+            </w:pPr>
+          </w:p>
+        </w:tc>
+      </w:tr>
+      <w:tr>
+        <w:tc>
+          <w:tcPr>
+            <w:cnfStyle w:val="001000000000" w:firstRow="0" w:lastRow="0" w:firstColumn="1" w:lastColumn="0" w:oddVBand="0" w:evenVBand="0" w:oddHBand="0" w:evenHBand="0" w:firstRowFirstColumn="0" w:firstRowLastColumn="0" w:lastRowFirstColumn="0" w:lastRowLastColumn="0"/>
+            <w:tcW w:w="2088" w:type="dxa"/>
+          </w:tcPr>
+          <w:p/>
+        </w:tc>
+        <w:tc>
+          <w:tcPr>
+            <w:tcW w:w="7020" w:type="dxa"/>
+          </w:tcPr>
+          <w:p>
+            <w:pPr>
+              <w:cnfStyle w:val="000000000000" w:firstRow="0" w:lastRow="0" w:firstColumn="0" w:lastColumn="0" w:oddVBand="0" w:evenVBand="0" w:oddHBand="0" w:evenHBand="0" w:firstRowFirstColumn="0" w:firstRowLastColumn="0" w:lastRowFirstColumn="0" w:lastRowLastColumn="0"/>
+            </w:pPr>
+          </w:p>
+        </w:tc>
+        <w:tc>
+          <w:tcPr>
+            <w:tcW w:w="1908" w:type="dxa"/>
+          </w:tcPr>
+          <w:p>
+            <w:pPr>
+              <w:cnfStyle w:val="000000000000" w:firstRow="0" w:lastRow="0" w:firstColumn="0" w:lastColumn="0" w:oddVBand="0" w:evenVBand="0" w:oddHBand="0" w:evenHBand="0" w:firstRowFirstColumn="0" w:firstRowLastColumn="0" w:lastRowFirstColumn="0" w:lastRowLastColumn="0"/>
+            </w:pPr>
+          </w:p>
+        </w:tc>
+      </w:tr>
+      <w:tr>
+        <w:trPr>
+          <w:cnfStyle w:val="000000100000" w:firstRow="0" w:lastRow="0" w:firstColumn="0" w:lastColumn="0" w:oddVBand="0" w:evenVBand="0" w:oddHBand="1" w:evenHBand="0" w:firstRowFirstColumn="0" w:firstRowLastColumn="0" w:lastRowFirstColumn="0" w:lastRowLastColumn="0"/>
+        </w:trPr>
+        <w:tc>
+          <w:tcPr>
+            <w:cnfStyle w:val="001000000000" w:firstRow="0" w:lastRow="0" w:firstColumn="1" w:lastColumn="0" w:oddVBand="0" w:evenVBand="0" w:oddHBand="0" w:evenHBand="0" w:firstRowFirstColumn="0" w:firstRowLastColumn="0" w:lastRowFirstColumn="0" w:lastRowLastColumn="0"/>
+            <w:tcW w:w="2088" w:type="dxa"/>
+          </w:tcPr>
+          <w:p/>
+        </w:tc>
+        <w:tc>
+          <w:tcPr>
+            <w:tcW w:w="7020" w:type="dxa"/>
+          </w:tcPr>
+          <w:p>
+            <w:pPr>
+              <w:cnfStyle w:val="000000100000" w:firstRow="0" w:lastRow="0" w:firstColumn="0" w:lastColumn="0" w:oddVBand="0" w:evenVBand="0" w:oddHBand="1" w:evenHBand="0" w:firstRowFirstColumn="0" w:firstRowLastColumn="0" w:lastRowFirstColumn="0" w:lastRowLastColumn="0"/>
+            </w:pPr>
+          </w:p>
+        </w:tc>
+        <w:tc>
+          <w:tcPr>
+            <w:tcW w:w="1908" w:type="dxa"/>
+          </w:tcPr>
+          <w:p>
+            <w:pPr>
+              <w:cnfStyle w:val="000000100000" w:firstRow="0" w:lastRow="0" w:firstColumn="0" w:lastColumn="0" w:oddVBand="0" w:evenVBand="0" w:oddHBand="1" w:evenHBand="0" w:firstRowFirstColumn="0" w:firstRowLastColumn="0" w:lastRowFirstColumn="0" w:lastRowLastColumn="0"/>
+            </w:pPr>
+          </w:p>
+        </w:tc>
+      </w:tr>
+      <w:tr>
+        <w:tc>
+          <w:tcPr>
+            <w:cnfStyle w:val="001000000000" w:firstRow="0" w:lastRow="0" w:firstColumn="1" w:lastColumn="0" w:oddVBand="0" w:evenVBand="0" w:oddHBand="0" w:evenHBand="0" w:firstRowFirstColumn="0" w:firstRowLastColumn="0" w:lastRowFirstColumn="0" w:lastRowLastColumn="0"/>
+            <w:tcW w:w="2088" w:type="dxa"/>
+          </w:tcPr>
+          <w:p/>
+        </w:tc>
+        <w:tc>
+          <w:tcPr>
+            <w:tcW w:w="7020" w:type="dxa"/>
+          </w:tcPr>
+          <w:p>
+            <w:pPr>
+              <w:cnfStyle w:val="000000000000" w:firstRow="0" w:lastRow="0" w:firstColumn="0" w:lastColumn="0" w:oddVBand="0" w:evenVBand="0" w:oddHBand="0" w:evenHBand="0" w:firstRowFirstColumn="0" w:firstRowLastColumn="0" w:lastRowFirstColumn="0" w:lastRowLastColumn="0"/>
+            </w:pPr>
+          </w:p>
+        </w:tc>
+        <w:tc>
+          <w:tcPr>
+            <w:tcW w:w="1908" w:type="dxa"/>
+          </w:tcPr>
+          <w:p>
+            <w:pPr>
+              <w:cnfStyle w:val="000000000000" w:firstRow="0" w:lastRow="0" w:firstColumn="0" w:lastColumn="0" w:oddVBand="0" w:evenVBand="0" w:oddHBand="0" w:evenHBand="0" w:firstRowFirstColumn="0" w:firstRowLastColumn="0" w:lastRowFirstColumn="0" w:lastRowLastColumn="0"/>
+            </w:pPr>
+          </w:p>
+        </w:tc>
+      </w:tr>
+      <w:tr>
+        <w:trPr>
+          <w:cnfStyle w:val="000000100000" w:firstRow="0" w:lastRow="0" w:firstColumn="0" w:lastColumn="0" w:oddVBand="0" w:evenVBand="0" w:oddHBand="1" w:evenHBand="0" w:firstRowFirstColumn="0" w:firstRowLastColumn="0" w:lastRowFirstColumn="0" w:lastRowLastColumn="0"/>
+        </w:trPr>
+        <w:tc>
+          <w:tcPr>
+            <w:cnfStyle w:val="001000000000" w:firstRow="0" w:lastRow="0" w:firstColumn="1" w:lastColumn="0" w:oddVBand="0" w:evenVBand="0" w:oddHBand="0" w:evenHBand="0" w:firstRowFirstColumn="0" w:firstRowLastColumn="0" w:lastRowFirstColumn="0" w:lastRowLastColumn="0"/>
+            <w:tcW w:w="2088" w:type="dxa"/>
+          </w:tcPr>
+          <w:p/>
+        </w:tc>
+        <w:tc>
+          <w:tcPr>
+            <w:tcW w:w="7020" w:type="dxa"/>
+          </w:tcPr>
+          <w:p>
+            <w:pPr>
+              <w:cnfStyle w:val="000000100000" w:firstRow="0" w:lastRow="0" w:firstColumn="0" w:lastColumn="0" w:oddVBand="0" w:evenVBand="0" w:oddHBand="1" w:evenHBand="0" w:firstRowFirstColumn="0" w:firstRowLastColumn="0" w:lastRowFirstColumn="0" w:lastRowLastColumn="0"/>
+            </w:pPr>
+          </w:p>
+        </w:tc>
+        <w:tc>
+          <w:tcPr>
+            <w:tcW w:w="1908" w:type="dxa"/>
+          </w:tcPr>
+          <w:p>
+            <w:pPr>
+              <w:cnfStyle w:val="000000100000" w:firstRow="0" w:lastRow="0" w:firstColumn="0" w:lastColumn="0" w:oddVBand="0" w:evenVBand="0" w:oddHBand="1" w:evenHBand="0" w:firstRowFirstColumn="0" w:firstRowLastColumn="0" w:lastRowFirstColumn="0" w:lastRowLastColumn="0"/>
+            </w:pPr>
+          </w:p>
+        </w:tc>
+      </w:tr>
+      <w:tr>
+        <w:tc>
+          <w:tcPr>
+            <w:cnfStyle w:val="001000000000" w:firstRow="0" w:lastRow="0" w:firstColumn="1" w:lastColumn="0" w:oddVBand="0" w:evenVBand="0" w:oddHBand="0" w:evenHBand="0" w:firstRowFirstColumn="0" w:firstRowLastColumn="0" w:lastRowFirstColumn="0" w:lastRowLastColumn="0"/>
+            <w:tcW w:w="2088" w:type="dxa"/>
+          </w:tcPr>
+          <w:p/>
+        </w:tc>
+        <w:tc>
+          <w:tcPr>
+            <w:tcW w:w="7020" w:type="dxa"/>
+          </w:tcPr>
+          <w:p>
+            <w:pPr>
+              <w:cnfStyle w:val="000000000000" w:firstRow="0" w:lastRow="0" w:firstColumn="0" w:lastColumn="0" w:oddVBand="0" w:evenVBand="0" w:oddHBand="0" w:evenHBand="0" w:firstRowFirstColumn="0" w:firstRowLastColumn="0" w:lastRowFirstColumn="0" w:lastRowLastColumn="0"/>
+            </w:pPr>
+          </w:p>
+        </w:tc>
+        <w:tc>
+          <w:tcPr>
+            <w:tcW w:w="1908" w:type="dxa"/>
+          </w:tcPr>
+          <w:p>
+            <w:pPr>
+              <w:cnfStyle w:val="000000000000" w:firstRow="0" w:lastRow="0" w:firstColumn="0" w:lastColumn="0" w:oddVBand="0" w:evenVBand="0" w:oddHBand="0" w:evenHBand="0" w:firstRowFirstColumn="0" w:firstRowLastColumn="0" w:lastRowFirstColumn="0" w:lastRowLastColumn="0"/>
+            </w:pPr>
+          </w:p>
+        </w:tc>
+      </w:tr>
+      <w:tr>
+        <w:trPr>
+          <w:cnfStyle w:val="000000100000" w:firstRow="0" w:lastRow="0" w:firstColumn="0" w:lastColumn="0" w:oddVBand="0" w:evenVBand="0" w:oddHBand="1" w:evenHBand="0" w:firstRowFirstColumn="0" w:firstRowLastColumn="0" w:lastRowFirstColumn="0" w:lastRowLastColumn="0"/>
+        </w:trPr>
+        <w:tc>
+          <w:tcPr>
+            <w:cnfStyle w:val="001000000000" w:firstRow="0" w:lastRow="0" w:firstColumn="1" w:lastColumn="0" w:oddVBand="0" w:evenVBand="0" w:oddHBand="0" w:evenHBand="0" w:firstRowFirstColumn="0" w:firstRowLastColumn="0" w:lastRowFirstColumn="0" w:lastRowLastColumn="0"/>
+            <w:tcW w:w="2088" w:type="dxa"/>
+          </w:tcPr>
+          <w:p/>
+        </w:tc>
+        <w:tc>
+          <w:tcPr>
+            <w:tcW w:w="7020" w:type="dxa"/>
+          </w:tcPr>
+          <w:p>
+            <w:pPr>
+              <w:cnfStyle w:val="000000100000" w:firstRow="0" w:lastRow="0" w:firstColumn="0" w:lastColumn="0" w:oddVBand="0" w:evenVBand="0" w:oddHBand="1" w:evenHBand="0" w:firstRowFirstColumn="0" w:firstRowLastColumn="0" w:lastRowFirstColumn="0" w:lastRowLastColumn="0"/>
+            </w:pPr>
+          </w:p>
+        </w:tc>
+        <w:tc>
+          <w:tcPr>
+            <w:tcW w:w="1908" w:type="dxa"/>
+          </w:tcPr>
+          <w:p>
+            <w:pPr>
+              <w:cnfStyle w:val="000000100000" w:firstRow="0" w:lastRow="0" w:firstColumn="0" w:lastColumn="0" w:oddVBand="0" w:evenVBand="0" w:oddHBand="1" w:evenHBand="0" w:firstRowFirstColumn="0" w:firstRowLastColumn="0" w:lastRowFirstColumn="0" w:lastRowLastColumn="0"/>
+            </w:pPr>
+          </w:p>
+        </w:tc>
+      </w:tr>
+    </w:tbl>
+    <w:p/>
+    <w:p>
+      <w:pPr>
+        <w:pStyle w:val="Heading1"/>
+      </w:pPr>
+      <w:r>
+        <w:t>Other Commands</w:t>
       </w:r>
     </w:p>
     <w:p>
       <w:r>
-        <w:t>The RJ command can be used to display all the journal entries for a physical file for a particular period of time. We keep 45 days of journals.</w:t>
-      </w:r>
-      <w:r>
-        <w:t xml:space="preserve"> If you know the time period of the changes you are looking for it is quicker to specify the from/to date range. The command defaults the output into work file ##RSTJRN in QTEMP. You are able to use a different file name or library name. For the most part, do not worry about the Journal receivers and Tape device parameters. </w:t>
+        <w:t>All commands have help text, so just prompt one and use F1 for information about it.</w:t>
       </w:r>
     </w:p>
+    <w:tbl>
+      <w:tblPr>
+        <w:tblStyle w:val="GridTable5Dark-Accent1"/>
+        <w:tblW w:w="0" w:type="auto"/>
+        <w:tblLook w:val="04A0" w:firstRow="1" w:lastRow="0" w:firstColumn="1" w:lastColumn="0" w:noHBand="0" w:noVBand="1"/>
+      </w:tblPr>
+      <w:tblGrid>
+        <w:gridCol w:w="2088"/>
+        <w:gridCol w:w="7020"/>
+        <w:gridCol w:w="1908"/>
+      </w:tblGrid>
+      <w:tr>
+        <w:trPr>
+          <w:cnfStyle w:val="100000000000" w:firstRow="1" w:lastRow="0" w:firstColumn="0" w:lastColumn="0" w:oddVBand="0" w:evenVBand="0" w:oddHBand="0" w:evenHBand="0" w:firstRowFirstColumn="0" w:firstRowLastColumn="0" w:lastRowFirstColumn="0" w:lastRowLastColumn="0"/>
+        </w:trPr>
+        <w:tc>
+          <w:tcPr>
+            <w:cnfStyle w:val="001000000000" w:firstRow="0" w:lastRow="0" w:firstColumn="1" w:lastColumn="0" w:oddVBand="0" w:evenVBand="0" w:oddHBand="0" w:evenHBand="0" w:firstRowFirstColumn="0" w:firstRowLastColumn="0" w:lastRowFirstColumn="0" w:lastRowLastColumn="0"/>
+            <w:tcW w:w="2088" w:type="dxa"/>
+          </w:tcPr>
+          <w:p>
+            <w:r>
+              <w:rPr>
+                <w:sz w:val="24"/>
+              </w:rPr>
+              <w:t>Command</w:t>
+            </w:r>
+          </w:p>
+        </w:tc>
+        <w:tc>
+          <w:tcPr>
+            <w:tcW w:w="7020" w:type="dxa"/>
+          </w:tcPr>
+          <w:p>
+            <w:pPr>
+              <w:cnfStyle w:val="100000000000" w:firstRow="1" w:lastRow="0" w:firstColumn="0" w:lastColumn="0" w:oddVBand="0" w:evenVBand="0" w:oddHBand="0" w:evenHBand="0" w:firstRowFirstColumn="0" w:firstRowLastColumn="0" w:lastRowFirstColumn="0" w:lastRowLastColumn="0"/>
+            </w:pPr>
+            <w:r>
+              <w:t>Description</w:t>
+            </w:r>
+          </w:p>
+        </w:tc>
+        <w:tc>
+          <w:tcPr>
+            <w:tcW w:w="1908" w:type="dxa"/>
+          </w:tcPr>
+          <w:p>
+            <w:pPr>
+              <w:cnfStyle w:val="100000000000" w:firstRow="1" w:lastRow="0" w:firstColumn="0" w:lastColumn="0" w:oddVBand="0" w:evenVBand="0" w:oddHBand="0" w:evenHBand="0" w:firstRowFirstColumn="0" w:firstRowLastColumn="0" w:lastRowFirstColumn="0" w:lastRowLastColumn="0"/>
+            </w:pPr>
+            <w:r>
+              <w:t>Status</w:t>
+            </w:r>
+          </w:p>
+        </w:tc>
+      </w:tr>
+      <w:tr>
+        <w:trPr>
+          <w:cnfStyle w:val="000000100000" w:firstRow="0" w:lastRow="0" w:firstColumn="0" w:lastColumn="0" w:oddVBand="0" w:evenVBand="0" w:oddHBand="1" w:evenHBand="0" w:firstRowFirstColumn="0" w:firstRowLastColumn="0" w:lastRowFirstColumn="0" w:lastRowLastColumn="0"/>
+        </w:trPr>
+        <w:tc>
+          <w:tcPr>
+            <w:cnfStyle w:val="001000000000" w:firstRow="0" w:lastRow="0" w:firstColumn="1" w:lastColumn="0" w:oddVBand="0" w:evenVBand="0" w:oddHBand="0" w:evenHBand="0" w:firstRowFirstColumn="0" w:firstRowLastColumn="0" w:lastRowFirstColumn="0" w:lastRowLastColumn="0"/>
+            <w:tcW w:w="2088" w:type="dxa"/>
+          </w:tcPr>
+          <w:p>
+            <w:r>
+              <w:t>ANLDLT</w:t>
+            </w:r>
+          </w:p>
+        </w:tc>
+        <w:tc>
+          <w:tcPr>
+            <w:tcW w:w="7020" w:type="dxa"/>
+          </w:tcPr>
+          <w:p>
+            <w:pPr>
+              <w:cnfStyle w:val="000000100000" w:firstRow="0" w:lastRow="0" w:firstColumn="0" w:lastColumn="0" w:oddVBand="0" w:evenVBand="0" w:oddHBand="1" w:evenHBand="0" w:firstRowFirstColumn="0" w:firstRowLastColumn="0" w:lastRowFirstColumn="0" w:lastRowLastColumn="0"/>
+            </w:pPr>
+            <w:r>
+              <w:t>Analyze deleted records in a library</w:t>
+            </w:r>
+            <w:r>
+              <w:t>, emails Excel file, Used for system Cleanup.</w:t>
+            </w:r>
+          </w:p>
+        </w:tc>
+        <w:tc>
+          <w:tcPr>
+            <w:tcW w:w="1908" w:type="dxa"/>
+          </w:tcPr>
+          <w:p>
+            <w:pPr>
+              <w:cnfStyle w:val="000000100000" w:firstRow="0" w:lastRow="0" w:firstColumn="0" w:lastColumn="0" w:oddVBand="0" w:evenVBand="0" w:oddHBand="1" w:evenHBand="0" w:firstRowFirstColumn="0" w:firstRowLastColumn="0" w:lastRowFirstColumn="0" w:lastRowLastColumn="0"/>
+            </w:pPr>
+          </w:p>
+        </w:tc>
+      </w:tr>
+      <w:tr>
+        <w:tc>
+          <w:tcPr>
+            <w:cnfStyle w:val="001000000000" w:firstRow="0" w:lastRow="0" w:firstColumn="1" w:lastColumn="0" w:oddVBand="0" w:evenVBand="0" w:oddHBand="0" w:evenHBand="0" w:firstRowFirstColumn="0" w:firstRowLastColumn="0" w:lastRowFirstColumn="0" w:lastRowLastColumn="0"/>
+            <w:tcW w:w="2088" w:type="dxa"/>
+          </w:tcPr>
+          <w:p>
+            <w:r>
+              <w:lastRenderedPageBreak/>
+              <w:t>C</w:t>
+            </w:r>
+          </w:p>
+        </w:tc>
+        <w:tc>
+          <w:tcPr>
+            <w:tcW w:w="7020" w:type="dxa"/>
+          </w:tcPr>
+          <w:p>
+            <w:pPr>
+              <w:cnfStyle w:val="000000000000" w:firstRow="0" w:lastRow="0" w:firstColumn="0" w:lastColumn="0" w:oddVBand="0" w:evenVBand="0" w:oddHBand="0" w:evenHBand="0" w:firstRowFirstColumn="0" w:firstRowLastColumn="0" w:lastRowFirstColumn="0" w:lastRowLastColumn="0"/>
+            </w:pPr>
+            <w:r>
+              <w:t>Call program</w:t>
+            </w:r>
+            <w:r>
+              <w:t>, short cut for CALL</w:t>
+            </w:r>
+          </w:p>
+        </w:tc>
+        <w:tc>
+          <w:tcPr>
+            <w:tcW w:w="1908" w:type="dxa"/>
+          </w:tcPr>
+          <w:p>
+            <w:pPr>
+              <w:cnfStyle w:val="000000000000" w:firstRow="0" w:lastRow="0" w:firstColumn="0" w:lastColumn="0" w:oddVBand="0" w:evenVBand="0" w:oddHBand="0" w:evenHBand="0" w:firstRowFirstColumn="0" w:firstRowLastColumn="0" w:lastRowFirstColumn="0" w:lastRowLastColumn="0"/>
+            </w:pPr>
+          </w:p>
+        </w:tc>
+      </w:tr>
+      <w:tr>
+        <w:trPr>
+          <w:cnfStyle w:val="000000100000" w:firstRow="0" w:lastRow="0" w:firstColumn="0" w:lastColumn="0" w:oddVBand="0" w:evenVBand="0" w:oddHBand="1" w:evenHBand="0" w:firstRowFirstColumn="0" w:firstRowLastColumn="0" w:lastRowFirstColumn="0" w:lastRowLastColumn="0"/>
+        </w:trPr>
+        <w:tc>
+          <w:tcPr>
+            <w:cnfStyle w:val="001000000000" w:firstRow="0" w:lastRow="0" w:firstColumn="1" w:lastColumn="0" w:oddVBand="0" w:evenVBand="0" w:oddHBand="0" w:evenHBand="0" w:firstRowFirstColumn="0" w:firstRowLastColumn="0" w:lastRowFirstColumn="0" w:lastRowLastColumn="0"/>
+            <w:tcW w:w="2088" w:type="dxa"/>
+          </w:tcPr>
+          <w:p>
+            <w:r>
+              <w:t>D</w:t>
+            </w:r>
+          </w:p>
+        </w:tc>
+        <w:tc>
+          <w:tcPr>
+            <w:tcW w:w="7020" w:type="dxa"/>
+          </w:tcPr>
+          <w:p>
+            <w:pPr>
+              <w:cnfStyle w:val="000000100000" w:firstRow="0" w:lastRow="0" w:firstColumn="0" w:lastColumn="0" w:oddVBand="0" w:evenVBand="0" w:oddHBand="1" w:evenHBand="0" w:firstRowFirstColumn="0" w:firstRowLastColumn="0" w:lastRowFirstColumn="0" w:lastRowLastColumn="0"/>
+            </w:pPr>
+            <w:r>
+              <w:t xml:space="preserve">Display Object </w:t>
+            </w:r>
+            <w:proofErr w:type="gramStart"/>
+            <w:r>
+              <w:t>Where</w:t>
+            </w:r>
+            <w:proofErr w:type="gramEnd"/>
+            <w:r>
+              <w:t xml:space="preserve"> Used</w:t>
+            </w:r>
+          </w:p>
+        </w:tc>
+        <w:tc>
+          <w:tcPr>
+            <w:tcW w:w="1908" w:type="dxa"/>
+          </w:tcPr>
+          <w:p>
+            <w:pPr>
+              <w:cnfStyle w:val="000000100000" w:firstRow="0" w:lastRow="0" w:firstColumn="0" w:lastColumn="0" w:oddVBand="0" w:evenVBand="0" w:oddHBand="1" w:evenHBand="0" w:firstRowFirstColumn="0" w:firstRowLastColumn="0" w:lastRowFirstColumn="0" w:lastRowLastColumn="0"/>
+            </w:pPr>
+            <w:r>
+              <w:t>TODO</w:t>
+            </w:r>
+          </w:p>
+        </w:tc>
+      </w:tr>
+      <w:tr>
+        <w:tc>
+          <w:tcPr>
+            <w:cnfStyle w:val="001000000000" w:firstRow="0" w:lastRow="0" w:firstColumn="1" w:lastColumn="0" w:oddVBand="0" w:evenVBand="0" w:oddHBand="0" w:evenHBand="0" w:firstRowFirstColumn="0" w:firstRowLastColumn="0" w:lastRowFirstColumn="0" w:lastRowLastColumn="0"/>
+            <w:tcW w:w="2088" w:type="dxa"/>
+          </w:tcPr>
+          <w:p>
+            <w:r>
+              <w:t>DAJ</w:t>
+            </w:r>
+          </w:p>
+        </w:tc>
+        <w:tc>
+          <w:tcPr>
+            <w:tcW w:w="7020" w:type="dxa"/>
+          </w:tcPr>
+          <w:p>
+            <w:pPr>
+              <w:cnfStyle w:val="000000000000" w:firstRow="0" w:lastRow="0" w:firstColumn="0" w:lastColumn="0" w:oddVBand="0" w:evenVBand="0" w:oddHBand="0" w:evenHBand="0" w:firstRowFirstColumn="0" w:firstRowLastColumn="0" w:lastRowFirstColumn="0" w:lastRowLastColumn="0"/>
+            </w:pPr>
+            <w:r>
+              <w:t>Work Active Jobs</w:t>
+            </w:r>
+            <w:r>
+              <w:t>, first parm is SBS</w:t>
+            </w:r>
+          </w:p>
+        </w:tc>
+        <w:tc>
+          <w:tcPr>
+            <w:tcW w:w="1908" w:type="dxa"/>
+          </w:tcPr>
+          <w:p>
+            <w:pPr>
+              <w:cnfStyle w:val="000000000000" w:firstRow="0" w:lastRow="0" w:firstColumn="0" w:lastColumn="0" w:oddVBand="0" w:evenVBand="0" w:oddHBand="0" w:evenHBand="0" w:firstRowFirstColumn="0" w:firstRowLastColumn="0" w:lastRowFirstColumn="0" w:lastRowLastColumn="0"/>
+            </w:pPr>
+          </w:p>
+        </w:tc>
+      </w:tr>
+      <w:tr>
+        <w:trPr>
+          <w:cnfStyle w:val="000000100000" w:firstRow="0" w:lastRow="0" w:firstColumn="0" w:lastColumn="0" w:oddVBand="0" w:evenVBand="0" w:oddHBand="1" w:evenHBand="0" w:firstRowFirstColumn="0" w:firstRowLastColumn="0" w:lastRowFirstColumn="0" w:lastRowLastColumn="0"/>
+        </w:trPr>
+        <w:tc>
+          <w:tcPr>
+            <w:cnfStyle w:val="001000000000" w:firstRow="0" w:lastRow="0" w:firstColumn="1" w:lastColumn="0" w:oddVBand="0" w:evenVBand="0" w:oddHBand="0" w:evenHBand="0" w:firstRowFirstColumn="0" w:firstRowLastColumn="0" w:lastRowFirstColumn="0" w:lastRowLastColumn="0"/>
+            <w:tcW w:w="2088" w:type="dxa"/>
+          </w:tcPr>
+          <w:p>
+            <w:r>
+              <w:t>FSM</w:t>
+            </w:r>
+          </w:p>
+        </w:tc>
+        <w:tc>
+          <w:tcPr>
+            <w:tcW w:w="7020" w:type="dxa"/>
+          </w:tcPr>
+          <w:p>
+            <w:pPr>
+              <w:cnfStyle w:val="000000100000" w:firstRow="0" w:lastRow="0" w:firstColumn="0" w:lastColumn="0" w:oddVBand="0" w:evenVBand="0" w:oddHBand="1" w:evenHBand="0" w:firstRowFirstColumn="0" w:firstRowLastColumn="0" w:lastRowFirstColumn="0" w:lastRowLastColumn="0"/>
+            </w:pPr>
+            <w:r>
+              <w:t>Display File/Fields</w:t>
+            </w:r>
+            <w:r>
+              <w:t xml:space="preserve"> (shortcut for DSPFLE command)</w:t>
+            </w:r>
+          </w:p>
+        </w:tc>
+        <w:tc>
+          <w:tcPr>
+            <w:tcW w:w="1908" w:type="dxa"/>
+          </w:tcPr>
+          <w:p>
+            <w:pPr>
+              <w:cnfStyle w:val="000000100000" w:firstRow="0" w:lastRow="0" w:firstColumn="0" w:lastColumn="0" w:oddVBand="0" w:evenVBand="0" w:oddHBand="1" w:evenHBand="0" w:firstRowFirstColumn="0" w:firstRowLastColumn="0" w:lastRowFirstColumn="0" w:lastRowLastColumn="0"/>
+            </w:pPr>
+          </w:p>
+        </w:tc>
+      </w:tr>
+      <w:tr>
+        <w:tc>
+          <w:tcPr>
+            <w:cnfStyle w:val="001000000000" w:firstRow="0" w:lastRow="0" w:firstColumn="1" w:lastColumn="0" w:oddVBand="0" w:evenVBand="0" w:oddHBand="0" w:evenHBand="0" w:firstRowFirstColumn="0" w:firstRowLastColumn="0" w:lastRowFirstColumn="0" w:lastRowLastColumn="0"/>
+            <w:tcW w:w="2088" w:type="dxa"/>
+          </w:tcPr>
+          <w:p>
+            <w:r>
+              <w:t>DSPFLE</w:t>
+            </w:r>
+          </w:p>
+        </w:tc>
+        <w:tc>
+          <w:tcPr>
+            <w:tcW w:w="7020" w:type="dxa"/>
+          </w:tcPr>
+          <w:p>
+            <w:pPr>
+              <w:cnfStyle w:val="000000000000" w:firstRow="0" w:lastRow="0" w:firstColumn="0" w:lastColumn="0" w:oddVBand="0" w:evenVBand="0" w:oddHBand="0" w:evenHBand="0" w:firstRowFirstColumn="0" w:firstRowLastColumn="0" w:lastRowFirstColumn="0" w:lastRowLastColumn="0"/>
+            </w:pPr>
+            <w:r>
+              <w:t>Display File/Fields</w:t>
+            </w:r>
+          </w:p>
+        </w:tc>
+        <w:tc>
+          <w:tcPr>
+            <w:tcW w:w="1908" w:type="dxa"/>
+          </w:tcPr>
+          <w:p>
+            <w:pPr>
+              <w:cnfStyle w:val="000000000000" w:firstRow="0" w:lastRow="0" w:firstColumn="0" w:lastColumn="0" w:oddVBand="0" w:evenVBand="0" w:oddHBand="0" w:evenHBand="0" w:firstRowFirstColumn="0" w:firstRowLastColumn="0" w:lastRowFirstColumn="0" w:lastRowLastColumn="0"/>
+            </w:pPr>
+          </w:p>
+        </w:tc>
+      </w:tr>
+      <w:tr>
+        <w:trPr>
+          <w:cnfStyle w:val="000000100000" w:firstRow="0" w:lastRow="0" w:firstColumn="0" w:lastColumn="0" w:oddVBand="0" w:evenVBand="0" w:oddHBand="1" w:evenHBand="0" w:firstRowFirstColumn="0" w:firstRowLastColumn="0" w:lastRowFirstColumn="0" w:lastRowLastColumn="0"/>
+        </w:trPr>
+        <w:tc>
+          <w:tcPr>
+            <w:cnfStyle w:val="001000000000" w:firstRow="0" w:lastRow="0" w:firstColumn="1" w:lastColumn="0" w:oddVBand="0" w:evenVBand="0" w:oddHBand="0" w:evenHBand="0" w:firstRowFirstColumn="0" w:firstRowLastColumn="0" w:lastRowFirstColumn="0" w:lastRowLastColumn="0"/>
+            <w:tcW w:w="2088" w:type="dxa"/>
+          </w:tcPr>
+          <w:p>
+            <w:r>
+              <w:t>DUPSPLF</w:t>
+            </w:r>
+          </w:p>
+        </w:tc>
+        <w:tc>
+          <w:tcPr>
+            <w:tcW w:w="7020" w:type="dxa"/>
+          </w:tcPr>
+          <w:p>
+            <w:pPr>
+              <w:cnfStyle w:val="000000100000" w:firstRow="0" w:lastRow="0" w:firstColumn="0" w:lastColumn="0" w:oddVBand="0" w:evenVBand="0" w:oddHBand="1" w:evenHBand="0" w:firstRowFirstColumn="0" w:firstRowLastColumn="0" w:lastRowFirstColumn="0" w:lastRowLastColumn="0"/>
+            </w:pPr>
+            <w:r>
+              <w:t>Duplicate spooled file</w:t>
+            </w:r>
+          </w:p>
+        </w:tc>
+        <w:tc>
+          <w:tcPr>
+            <w:tcW w:w="1908" w:type="dxa"/>
+          </w:tcPr>
+          <w:p>
+            <w:pPr>
+              <w:cnfStyle w:val="000000100000" w:firstRow="0" w:lastRow="0" w:firstColumn="0" w:lastColumn="0" w:oddVBand="0" w:evenVBand="0" w:oddHBand="1" w:evenHBand="0" w:firstRowFirstColumn="0" w:firstRowLastColumn="0" w:lastRowFirstColumn="0" w:lastRowLastColumn="0"/>
+            </w:pPr>
+          </w:p>
+        </w:tc>
+      </w:tr>
+      <w:tr>
+        <w:tc>
+          <w:tcPr>
+            <w:cnfStyle w:val="001000000000" w:firstRow="0" w:lastRow="0" w:firstColumn="1" w:lastColumn="0" w:oddVBand="0" w:evenVBand="0" w:oddHBand="0" w:evenHBand="0" w:firstRowFirstColumn="0" w:firstRowLastColumn="0" w:lastRowFirstColumn="0" w:lastRowLastColumn="0"/>
+            <w:tcW w:w="2088" w:type="dxa"/>
+          </w:tcPr>
+          <w:p>
+            <w:r>
+              <w:t>LSTOBJ</w:t>
+            </w:r>
+          </w:p>
+        </w:tc>
+        <w:tc>
+          <w:tcPr>
+            <w:tcW w:w="7020" w:type="dxa"/>
+          </w:tcPr>
+          <w:p>
+            <w:pPr>
+              <w:cnfStyle w:val="000000000000" w:firstRow="0" w:lastRow="0" w:firstColumn="0" w:lastColumn="0" w:oddVBand="0" w:evenVBand="0" w:oddHBand="0" w:evenHBand="0" w:firstRowFirstColumn="0" w:firstRowLastColumn="0" w:lastRowFirstColumn="0" w:lastRowLastColumn="0"/>
+            </w:pPr>
+            <w:r>
+              <w:t>List objects in libraries, emails Excel file, used for system cleanup.</w:t>
+            </w:r>
+          </w:p>
+        </w:tc>
+        <w:tc>
+          <w:tcPr>
+            <w:tcW w:w="1908" w:type="dxa"/>
+          </w:tcPr>
+          <w:p>
+            <w:pPr>
+              <w:cnfStyle w:val="000000000000" w:firstRow="0" w:lastRow="0" w:firstColumn="0" w:lastColumn="0" w:oddVBand="0" w:evenVBand="0" w:oddHBand="0" w:evenHBand="0" w:firstRowFirstColumn="0" w:firstRowLastColumn="0" w:lastRowFirstColumn="0" w:lastRowLastColumn="0"/>
+            </w:pPr>
+          </w:p>
+        </w:tc>
+      </w:tr>
+      <w:tr>
+        <w:trPr>
+          <w:cnfStyle w:val="000000100000" w:firstRow="0" w:lastRow="0" w:firstColumn="0" w:lastColumn="0" w:oddVBand="0" w:evenVBand="0" w:oddHBand="1" w:evenHBand="0" w:firstRowFirstColumn="0" w:firstRowLastColumn="0" w:lastRowFirstColumn="0" w:lastRowLastColumn="0"/>
+        </w:trPr>
+        <w:tc>
+          <w:tcPr>
+            <w:cnfStyle w:val="001000000000" w:firstRow="0" w:lastRow="0" w:firstColumn="1" w:lastColumn="0" w:oddVBand="0" w:evenVBand="0" w:oddHBand="0" w:evenHBand="0" w:firstRowFirstColumn="0" w:firstRowLastColumn="0" w:lastRowFirstColumn="0" w:lastRowLastColumn="0"/>
+            <w:tcW w:w="2088" w:type="dxa"/>
+          </w:tcPr>
+          <w:p>
+            <w:r>
+              <w:t>LOOKUP</w:t>
+            </w:r>
+          </w:p>
+        </w:tc>
+        <w:tc>
+          <w:tcPr>
+            <w:tcW w:w="7020" w:type="dxa"/>
+          </w:tcPr>
+          <w:p>
+            <w:pPr>
+              <w:cnfStyle w:val="000000100000" w:firstRow="0" w:lastRow="0" w:firstColumn="0" w:lastColumn="0" w:oddVBand="0" w:evenVBand="0" w:oddHBand="1" w:evenHBand="0" w:firstRowFirstColumn="0" w:firstRowLastColumn="0" w:lastRowFirstColumn="0" w:lastRowLastColumn="0"/>
+            </w:pPr>
+            <w:r>
+              <w:t>Lookup value from Table using SQL in a CLP</w:t>
+            </w:r>
+          </w:p>
+        </w:tc>
+        <w:tc>
+          <w:tcPr>
+            <w:tcW w:w="1908" w:type="dxa"/>
+          </w:tcPr>
+          <w:p>
+            <w:pPr>
+              <w:cnfStyle w:val="000000100000" w:firstRow="0" w:lastRow="0" w:firstColumn="0" w:lastColumn="0" w:oddVBand="0" w:evenVBand="0" w:oddHBand="1" w:evenHBand="0" w:firstRowFirstColumn="0" w:firstRowLastColumn="0" w:lastRowFirstColumn="0" w:lastRowLastColumn="0"/>
+            </w:pPr>
+            <w:r>
+              <w:t>TODO</w:t>
+            </w:r>
+          </w:p>
+        </w:tc>
+      </w:tr>
+      <w:tr>
+        <w:tc>
+          <w:tcPr>
+            <w:cnfStyle w:val="001000000000" w:firstRow="0" w:lastRow="0" w:firstColumn="1" w:lastColumn="0" w:oddVBand="0" w:evenVBand="0" w:oddHBand="0" w:evenHBand="0" w:firstRowFirstColumn="0" w:firstRowLastColumn="0" w:lastRowFirstColumn="0" w:lastRowLastColumn="0"/>
+            <w:tcW w:w="2088" w:type="dxa"/>
+          </w:tcPr>
+          <w:p>
+            <w:r>
+              <w:t>SCANDAT</w:t>
+            </w:r>
+          </w:p>
+        </w:tc>
+        <w:tc>
+          <w:tcPr>
+            <w:tcW w:w="7020" w:type="dxa"/>
+          </w:tcPr>
+          <w:p>
+            <w:pPr>
+              <w:cnfStyle w:val="000000000000" w:firstRow="0" w:lastRow="0" w:firstColumn="0" w:lastColumn="0" w:oddVBand="0" w:evenVBand="0" w:oddHBand="0" w:evenHBand="0" w:firstRowFirstColumn="0" w:firstRowLastColumn="0" w:lastRowFirstColumn="0" w:lastRowLastColumn="0"/>
+            </w:pPr>
+            <w:r>
+              <w:t>Scan data files for a value</w:t>
+            </w:r>
+          </w:p>
+        </w:tc>
+        <w:tc>
+          <w:tcPr>
+            <w:tcW w:w="1908" w:type="dxa"/>
+          </w:tcPr>
+          <w:p>
+            <w:pPr>
+              <w:cnfStyle w:val="000000000000" w:firstRow="0" w:lastRow="0" w:firstColumn="0" w:lastColumn="0" w:oddVBand="0" w:evenVBand="0" w:oddHBand="0" w:evenHBand="0" w:firstRowFirstColumn="0" w:firstRowLastColumn="0" w:lastRowFirstColumn="0" w:lastRowLastColumn="0"/>
+            </w:pPr>
+            <w:r>
+              <w:t>TODO</w:t>
+            </w:r>
+          </w:p>
+        </w:tc>
+      </w:tr>
+      <w:tr>
+        <w:trPr>
+          <w:cnfStyle w:val="000000100000" w:firstRow="0" w:lastRow="0" w:firstColumn="0" w:lastColumn="0" w:oddVBand="0" w:evenVBand="0" w:oddHBand="1" w:evenHBand="0" w:firstRowFirstColumn="0" w:firstRowLastColumn="0" w:lastRowFirstColumn="0" w:lastRowLastColumn="0"/>
+        </w:trPr>
+        <w:tc>
+          <w:tcPr>
+            <w:cnfStyle w:val="001000000000" w:firstRow="0" w:lastRow="0" w:firstColumn="1" w:lastColumn="0" w:oddVBand="0" w:evenVBand="0" w:oddHBand="0" w:evenHBand="0" w:firstRowFirstColumn="0" w:firstRowLastColumn="0" w:lastRowFirstColumn="0" w:lastRowLastColumn="0"/>
+            <w:tcW w:w="2088" w:type="dxa"/>
+          </w:tcPr>
+          <w:p>
+            <w:r>
+              <w:t>SCANSRC</w:t>
+            </w:r>
+          </w:p>
+        </w:tc>
+        <w:tc>
+          <w:tcPr>
+            <w:tcW w:w="7020" w:type="dxa"/>
+          </w:tcPr>
+          <w:p>
+            <w:pPr>
+              <w:cnfStyle w:val="000000100000" w:firstRow="0" w:lastRow="0" w:firstColumn="0" w:lastColumn="0" w:oddVBand="0" w:evenVBand="0" w:oddHBand="1" w:evenHBand="0" w:firstRowFirstColumn="0" w:firstRowLastColumn="0" w:lastRowFirstColumn="0" w:lastRowLastColumn="0"/>
+            </w:pPr>
+            <w:r>
+              <w:t>Scan source members</w:t>
+            </w:r>
+          </w:p>
+        </w:tc>
+        <w:tc>
+          <w:tcPr>
+            <w:tcW w:w="1908" w:type="dxa"/>
+          </w:tcPr>
+          <w:p>
+            <w:pPr>
+              <w:cnfStyle w:val="000000100000" w:firstRow="0" w:lastRow="0" w:firstColumn="0" w:lastColumn="0" w:oddVBand="0" w:evenVBand="0" w:oddHBand="1" w:evenHBand="0" w:firstRowFirstColumn="0" w:firstRowLastColumn="0" w:lastRowFirstColumn="0" w:lastRowLastColumn="0"/>
+            </w:pPr>
+            <w:r>
+              <w:t>TODO</w:t>
+            </w:r>
+          </w:p>
+        </w:tc>
+      </w:tr>
+      <w:tr>
+        <w:tc>
+          <w:tcPr>
+            <w:cnfStyle w:val="001000000000" w:firstRow="0" w:lastRow="0" w:firstColumn="1" w:lastColumn="0" w:oddVBand="0" w:evenVBand="0" w:oddHBand="0" w:evenHBand="0" w:firstRowFirstColumn="0" w:firstRowLastColumn="0" w:lastRowFirstColumn="0" w:lastRowLastColumn="0"/>
+            <w:tcW w:w="2088" w:type="dxa"/>
+          </w:tcPr>
+          <w:p>
+            <w:r>
+              <w:t>SRJ</w:t>
+            </w:r>
+          </w:p>
+        </w:tc>
+        <w:tc>
+          <w:tcPr>
+            <w:tcW w:w="7020" w:type="dxa"/>
+          </w:tcPr>
+          <w:p>
+            <w:pPr>
+              <w:cnfStyle w:val="000000000000" w:firstRow="0" w:lastRow="0" w:firstColumn="0" w:lastColumn="0" w:oddVBand="0" w:evenVBand="0" w:oddHBand="0" w:evenHBand="0" w:firstRowFirstColumn="0" w:firstRowLastColumn="0" w:lastRowFirstColumn="0" w:lastRowLastColumn="0"/>
+            </w:pPr>
+            <w:r>
+              <w:t>Submit a journal restore to batch</w:t>
+            </w:r>
+          </w:p>
+        </w:tc>
+        <w:tc>
+          <w:tcPr>
+            <w:tcW w:w="1908" w:type="dxa"/>
+          </w:tcPr>
+          <w:p>
+            <w:pPr>
+              <w:cnfStyle w:val="000000000000" w:firstRow="0" w:lastRow="0" w:firstColumn="0" w:lastColumn="0" w:oddVBand="0" w:evenVBand="0" w:oddHBand="0" w:evenHBand="0" w:firstRowFirstColumn="0" w:firstRowLastColumn="0" w:lastRowFirstColumn="0" w:lastRowLastColumn="0"/>
+            </w:pPr>
+          </w:p>
+        </w:tc>
+      </w:tr>
+      <w:tr>
+        <w:trPr>
+          <w:cnfStyle w:val="000000100000" w:firstRow="0" w:lastRow="0" w:firstColumn="0" w:lastColumn="0" w:oddVBand="0" w:evenVBand="0" w:oddHBand="1" w:evenHBand="0" w:firstRowFirstColumn="0" w:firstRowLastColumn="0" w:lastRowFirstColumn="0" w:lastRowLastColumn="0"/>
+        </w:trPr>
+        <w:tc>
+          <w:tcPr>
+            <w:cnfStyle w:val="001000000000" w:firstRow="0" w:lastRow="0" w:firstColumn="1" w:lastColumn="0" w:oddVBand="0" w:evenVBand="0" w:oddHBand="0" w:evenHBand="0" w:firstRowFirstColumn="0" w:firstRowLastColumn="0" w:lastRowFirstColumn="0" w:lastRowLastColumn="0"/>
+            <w:tcW w:w="2088" w:type="dxa"/>
+          </w:tcPr>
+          <w:p>
+            <w:r>
+              <w:t>WO</w:t>
+            </w:r>
+          </w:p>
+        </w:tc>
+        <w:tc>
+          <w:tcPr>
+            <w:tcW w:w="7020" w:type="dxa"/>
+          </w:tcPr>
+          <w:p>
+            <w:pPr>
+              <w:cnfStyle w:val="000000100000" w:firstRow="0" w:lastRow="0" w:firstColumn="0" w:lastColumn="0" w:oddVBand="0" w:evenVBand="0" w:oddHBand="1" w:evenHBand="0" w:firstRowFirstColumn="0" w:firstRowLastColumn="0" w:lastRowFirstColumn="0" w:lastRowLastColumn="0"/>
+            </w:pPr>
+            <w:r>
+              <w:t>Work with objects – WRKOBJ shortcut</w:t>
+            </w:r>
+          </w:p>
+        </w:tc>
+        <w:tc>
+          <w:tcPr>
+            <w:tcW w:w="1908" w:type="dxa"/>
+          </w:tcPr>
+          <w:p>
+            <w:pPr>
+              <w:cnfStyle w:val="000000100000" w:firstRow="0" w:lastRow="0" w:firstColumn="0" w:lastColumn="0" w:oddVBand="0" w:evenVBand="0" w:oddHBand="1" w:evenHBand="0" w:firstRowFirstColumn="0" w:firstRowLastColumn="0" w:lastRowFirstColumn="0" w:lastRowLastColumn="0"/>
+            </w:pPr>
+          </w:p>
+        </w:tc>
+      </w:tr>
+    </w:tbl>
+    <w:p/>
     <w:p>
-      <w:pPr>
-        <w:rPr>
-          <w:sz w:val="40"/>
-          <w:szCs w:val="40"/>
-        </w:rPr>
-      </w:pPr>
-      <w:proofErr w:type="gramStart"/>
-      <w:r>
-        <w:rPr>
-          <w:sz w:val="40"/>
-          <w:szCs w:val="40"/>
-        </w:rPr>
-        <w:t>So</w:t>
-      </w:r>
-      <w:proofErr w:type="gramEnd"/>
-      <w:r>
-        <w:rPr>
-          <w:sz w:val="40"/>
-          <w:szCs w:val="40"/>
-        </w:rPr>
-        <w:t xml:space="preserve"> you should be able to just enter R</w:t>
-      </w:r>
-      <w:r>
-        <w:rPr>
-          <w:sz w:val="40"/>
-          <w:szCs w:val="40"/>
-        </w:rPr>
-        <w:t>J</w:t>
-      </w:r>
-      <w:r>
-        <w:rPr>
-          <w:sz w:val="40"/>
-          <w:szCs w:val="40"/>
-        </w:rPr>
-        <w:t xml:space="preserve"> CUSTPF</w:t>
-      </w:r>
-      <w:r>
-        <w:rPr>
-          <w:sz w:val="40"/>
-          <w:szCs w:val="40"/>
-        </w:rPr>
-        <w:t xml:space="preserve">. </w:t>
-      </w:r>
-    </w:p>
-    <w:p>
-      <w:pPr>
-        <w:rPr>
-          <w:sz w:val="28"/>
-          <w:szCs w:val="28"/>
-        </w:rPr>
-      </w:pPr>
-      <w:r>
-        <w:rPr>
-          <w:sz w:val="28"/>
-          <w:szCs w:val="28"/>
-        </w:rPr>
-        <w:br w:type="page"/>
-      </w:r>
-    </w:p>
-    <w:p>
-      <w:pPr>
-        <w:rPr>
-          <w:sz w:val="72"/>
-          <w:szCs w:val="72"/>
-        </w:rPr>
-      </w:pPr>
-      <w:r>
-        <w:rPr>
-          <w:sz w:val="72"/>
-          <w:szCs w:val="72"/>
-        </w:rPr>
-        <w:lastRenderedPageBreak/>
-        <w:t>Other Commands</w:t>
-      </w:r>
-    </w:p>
-    <w:p>
-      <w:pPr>
-        <w:pStyle w:val="ListParagraph"/>
-        <w:numPr>
-          <w:ilvl w:val="0"/>
-          <w:numId w:val="4"/>
-        </w:numPr>
-      </w:pPr>
-      <w:r>
-        <w:t>C</w:t>
-      </w:r>
-      <w:r>
-        <w:tab/>
-        <w:t>Call program</w:t>
-      </w:r>
-    </w:p>
-    <w:p>
-      <w:pPr>
-        <w:pStyle w:val="ListParagraph"/>
-        <w:numPr>
-          <w:ilvl w:val="0"/>
-          <w:numId w:val="4"/>
-        </w:numPr>
-      </w:pPr>
-      <w:r>
-        <w:t>D</w:t>
-      </w:r>
-      <w:r>
-        <w:tab/>
-        <w:t>Display Object where used</w:t>
-      </w:r>
-      <w:r>
-        <w:t xml:space="preserve"> – TODO recreate this</w:t>
-      </w:r>
-    </w:p>
-    <w:p>
-      <w:pPr>
-        <w:pStyle w:val="ListParagraph"/>
-        <w:numPr>
-          <w:ilvl w:val="0"/>
-          <w:numId w:val="4"/>
-        </w:numPr>
-      </w:pPr>
-      <w:r>
-        <w:t>DAJ</w:t>
-      </w:r>
-      <w:r>
-        <w:tab/>
-        <w:t>Work Active Jobs</w:t>
-      </w:r>
-    </w:p>
-    <w:p>
-      <w:pPr>
-        <w:pStyle w:val="ListParagraph"/>
-        <w:numPr>
-          <w:ilvl w:val="0"/>
-          <w:numId w:val="4"/>
-        </w:numPr>
-      </w:pPr>
-      <w:r>
-        <w:t>DJQ</w:t>
-      </w:r>
-      <w:r>
-        <w:tab/>
-        <w:t xml:space="preserve">Display </w:t>
-      </w:r>
-      <w:proofErr w:type="gramStart"/>
-      <w:r>
-        <w:t>Job  Queue</w:t>
-      </w:r>
-      <w:proofErr w:type="gramEnd"/>
-    </w:p>
-    <w:p>
-      <w:pPr>
-        <w:pStyle w:val="ListParagraph"/>
-        <w:numPr>
-          <w:ilvl w:val="0"/>
-          <w:numId w:val="4"/>
-        </w:numPr>
-      </w:pPr>
-      <w:r>
-        <w:t>DM</w:t>
-      </w:r>
-      <w:r>
-        <w:tab/>
-        <w:t>Display your messages</w:t>
-      </w:r>
-    </w:p>
-    <w:p>
-      <w:pPr>
-        <w:pStyle w:val="ListParagraph"/>
-        <w:numPr>
-          <w:ilvl w:val="0"/>
-          <w:numId w:val="4"/>
-        </w:numPr>
-      </w:pPr>
-      <w:r>
-        <w:t>DMQ</w:t>
-      </w:r>
-      <w:r>
-        <w:tab/>
-        <w:t>Display QSYSOPR messages</w:t>
-      </w:r>
-    </w:p>
-    <w:p>
-      <w:pPr>
-        <w:pStyle w:val="ListParagraph"/>
-        <w:numPr>
-          <w:ilvl w:val="0"/>
-          <w:numId w:val="4"/>
-        </w:numPr>
-      </w:pPr>
-      <w:r>
-        <w:t>DOQ</w:t>
-      </w:r>
-      <w:r>
-        <w:tab/>
-        <w:t>Work with output queue</w:t>
-      </w:r>
-    </w:p>
-    <w:p>
-      <w:pPr>
-        <w:pStyle w:val="ListParagraph"/>
-        <w:numPr>
-          <w:ilvl w:val="0"/>
-          <w:numId w:val="4"/>
-        </w:numPr>
-      </w:pPr>
-      <w:r>
-        <w:t>DOQQ</w:t>
-      </w:r>
-      <w:r>
-        <w:tab/>
-      </w:r>
-      <w:r>
-        <w:t>Work with QPRINT</w:t>
-      </w:r>
-    </w:p>
-    <w:p>
-      <w:pPr>
-        <w:pStyle w:val="ListParagraph"/>
-        <w:numPr>
-          <w:ilvl w:val="0"/>
-          <w:numId w:val="4"/>
-        </w:numPr>
-      </w:pPr>
-      <w:r>
-        <w:t>DSBS</w:t>
-      </w:r>
-      <w:r>
-        <w:tab/>
-        <w:t>Work with subsystem</w:t>
-      </w:r>
-    </w:p>
-    <w:p>
-      <w:pPr>
-        <w:pStyle w:val="ListParagraph"/>
-        <w:numPr>
-          <w:ilvl w:val="0"/>
-          <w:numId w:val="4"/>
-        </w:numPr>
-      </w:pPr>
-      <w:r>
-        <w:t>FSM</w:t>
-      </w:r>
-      <w:r>
-        <w:tab/>
-        <w:t>Display File/Fields</w:t>
-      </w:r>
-    </w:p>
-    <w:p>
-      <w:pPr>
-        <w:pStyle w:val="ListParagraph"/>
-        <w:numPr>
-          <w:ilvl w:val="0"/>
-          <w:numId w:val="4"/>
-        </w:numPr>
-      </w:pPr>
-      <w:r>
-        <w:t>DSS</w:t>
-      </w:r>
-      <w:r>
-        <w:tab/>
-        <w:t>Work with system status</w:t>
-      </w:r>
-    </w:p>
-    <w:p>
-      <w:pPr>
-        <w:pStyle w:val="ListParagraph"/>
-        <w:numPr>
-          <w:ilvl w:val="0"/>
-          <w:numId w:val="4"/>
-        </w:numPr>
-      </w:pPr>
-      <w:r>
-        <w:t>DUP</w:t>
-      </w:r>
-      <w:r>
-        <w:tab/>
-        <w:t>Display user profile</w:t>
-      </w:r>
-    </w:p>
-    <w:p>
-      <w:pPr>
-        <w:pStyle w:val="ListParagraph"/>
-        <w:numPr>
-          <w:ilvl w:val="0"/>
-          <w:numId w:val="4"/>
-        </w:numPr>
-      </w:pPr>
-      <w:r>
-        <w:t>DUPSPLF</w:t>
-      </w:r>
-      <w:r>
-        <w:tab/>
-        <w:t>Duplicate spooled file</w:t>
-      </w:r>
-    </w:p>
-    <w:p>
-      <w:pPr>
-        <w:pStyle w:val="ListParagraph"/>
-        <w:numPr>
-          <w:ilvl w:val="0"/>
-          <w:numId w:val="4"/>
-        </w:numPr>
-      </w:pPr>
-      <w:r>
-        <w:t xml:space="preserve">LOOKUP </w:t>
-      </w:r>
-      <w:r>
-        <w:tab/>
-      </w:r>
-      <w:proofErr w:type="spellStart"/>
-      <w:r>
-        <w:t>Lookup</w:t>
-      </w:r>
-      <w:proofErr w:type="spellEnd"/>
-      <w:r>
-        <w:t xml:space="preserve"> value from Table using SQL in a CLP</w:t>
-      </w:r>
-    </w:p>
-    <w:p>
-      <w:pPr>
-        <w:pStyle w:val="ListParagraph"/>
-        <w:numPr>
-          <w:ilvl w:val="0"/>
-          <w:numId w:val="4"/>
-        </w:numPr>
-      </w:pPr>
-      <w:r>
-        <w:t>SCANDAT</w:t>
-      </w:r>
-      <w:r>
-        <w:tab/>
-        <w:t>Scan data files for a value</w:t>
-      </w:r>
-    </w:p>
-    <w:p>
-      <w:pPr>
-        <w:pStyle w:val="ListParagraph"/>
-        <w:numPr>
-          <w:ilvl w:val="0"/>
-          <w:numId w:val="4"/>
-        </w:numPr>
-      </w:pPr>
-      <w:r>
-        <w:t>SCANSRC</w:t>
-      </w:r>
-      <w:r>
-        <w:tab/>
-        <w:t>Scan source members</w:t>
-      </w:r>
-    </w:p>
-    <w:p>
-      <w:pPr>
-        <w:pStyle w:val="ListParagraph"/>
-        <w:numPr>
-          <w:ilvl w:val="0"/>
-          <w:numId w:val="4"/>
-        </w:numPr>
-      </w:pPr>
-      <w:r>
-        <w:t>WO</w:t>
-      </w:r>
-      <w:r>
-        <w:tab/>
-        <w:t>Work with objects using PDM – WRKOBJPDM</w:t>
-      </w:r>
-    </w:p>
-    <w:p>
-      <w:pPr>
-        <w:pStyle w:val="ListParagraph"/>
-        <w:numPr>
-          <w:ilvl w:val="0"/>
-          <w:numId w:val="4"/>
-        </w:numPr>
-      </w:pPr>
-      <w:r>
-        <w:t>WRTRPGLVL</w:t>
-      </w:r>
-      <w:r>
-        <w:tab/>
-        <w:t>Write RPG Nesting Levels</w:t>
-      </w:r>
-    </w:p>
-    <w:p>
-      <w:pPr>
-        <w:rPr>
-          <w:sz w:val="28"/>
-          <w:szCs w:val="28"/>
-        </w:rPr>
-      </w:pPr>
+      <w:r>
+        <w:t>There is a host of commands used for the dictionary, file and program system. View that system documentation for a list of those commands.</w:t>
+      </w:r>
     </w:p>
     <w:sectPr>
       <w:pgSz w:w="12240" w:h="15840"/>
@@ -1471,9 +2340,52 @@
   <w:style w:type="paragraph" w:default="1" w:styleId="Normal">
     <w:name w:val="Normal"/>
     <w:qFormat/>
-    <w:rsid w:val="00EB2C38"/>
+    <w:rsid w:val="00221145"/>
     <w:rPr>
       <w:sz w:val="24"/>
+    </w:rPr>
+  </w:style>
+  <w:style w:type="paragraph" w:styleId="Heading1">
+    <w:name w:val="heading 1"/>
+    <w:basedOn w:val="Normal"/>
+    <w:next w:val="Normal"/>
+    <w:link w:val="Heading1Char"/>
+    <w:uiPriority w:val="9"/>
+    <w:qFormat/>
+    <w:rsid w:val="00D47C23"/>
+    <w:pPr>
+      <w:keepNext/>
+      <w:keepLines/>
+      <w:spacing w:before="240" w:after="0"/>
+      <w:outlineLvl w:val="0"/>
+    </w:pPr>
+    <w:rPr>
+      <w:rFonts w:asciiTheme="majorHAnsi" w:eastAsiaTheme="majorEastAsia" w:hAnsiTheme="majorHAnsi" w:cstheme="majorBidi"/>
+      <w:color w:val="365F91" w:themeColor="accent1" w:themeShade="BF"/>
+      <w:sz w:val="32"/>
+      <w:szCs w:val="32"/>
+    </w:rPr>
+  </w:style>
+  <w:style w:type="paragraph" w:styleId="Heading2">
+    <w:name w:val="heading 2"/>
+    <w:basedOn w:val="Normal"/>
+    <w:next w:val="Normal"/>
+    <w:link w:val="Heading2Char"/>
+    <w:uiPriority w:val="9"/>
+    <w:unhideWhenUsed/>
+    <w:qFormat/>
+    <w:rsid w:val="00D47C23"/>
+    <w:pPr>
+      <w:keepNext/>
+      <w:keepLines/>
+      <w:spacing w:before="40" w:after="0"/>
+      <w:outlineLvl w:val="1"/>
+    </w:pPr>
+    <w:rPr>
+      <w:rFonts w:asciiTheme="majorHAnsi" w:eastAsiaTheme="majorEastAsia" w:hAnsiTheme="majorHAnsi" w:cstheme="majorBidi"/>
+      <w:color w:val="365F91" w:themeColor="accent1" w:themeShade="BF"/>
+      <w:sz w:val="26"/>
+      <w:szCs w:val="26"/>
     </w:rPr>
   </w:style>
   <w:style w:type="character" w:default="1" w:styleId="DefaultParagraphFont">
@@ -1577,6 +2489,157 @@
       <w:sz w:val="56"/>
       <w:szCs w:val="56"/>
     </w:rPr>
+  </w:style>
+  <w:style w:type="character" w:customStyle="1" w:styleId="Heading1Char">
+    <w:name w:val="Heading 1 Char"/>
+    <w:basedOn w:val="DefaultParagraphFont"/>
+    <w:link w:val="Heading1"/>
+    <w:uiPriority w:val="9"/>
+    <w:rsid w:val="00D47C23"/>
+    <w:rPr>
+      <w:rFonts w:asciiTheme="majorHAnsi" w:eastAsiaTheme="majorEastAsia" w:hAnsiTheme="majorHAnsi" w:cstheme="majorBidi"/>
+      <w:color w:val="365F91" w:themeColor="accent1" w:themeShade="BF"/>
+      <w:sz w:val="32"/>
+      <w:szCs w:val="32"/>
+    </w:rPr>
+  </w:style>
+  <w:style w:type="character" w:customStyle="1" w:styleId="Heading2Char">
+    <w:name w:val="Heading 2 Char"/>
+    <w:basedOn w:val="DefaultParagraphFont"/>
+    <w:link w:val="Heading2"/>
+    <w:uiPriority w:val="9"/>
+    <w:rsid w:val="00D47C23"/>
+    <w:rPr>
+      <w:rFonts w:asciiTheme="majorHAnsi" w:eastAsiaTheme="majorEastAsia" w:hAnsiTheme="majorHAnsi" w:cstheme="majorBidi"/>
+      <w:color w:val="365F91" w:themeColor="accent1" w:themeShade="BF"/>
+      <w:sz w:val="26"/>
+      <w:szCs w:val="26"/>
+    </w:rPr>
+  </w:style>
+  <w:style w:type="table" w:styleId="TableGrid">
+    <w:name w:val="Table Grid"/>
+    <w:basedOn w:val="TableNormal"/>
+    <w:uiPriority w:val="59"/>
+    <w:rsid w:val="007B4251"/>
+    <w:pPr>
+      <w:spacing w:after="0" w:line="240" w:lineRule="auto"/>
+    </w:pPr>
+    <w:tblPr>
+      <w:tblBorders>
+        <w:top w:val="single" w:sz="4" w:space="0" w:color="auto"/>
+        <w:left w:val="single" w:sz="4" w:space="0" w:color="auto"/>
+        <w:bottom w:val="single" w:sz="4" w:space="0" w:color="auto"/>
+        <w:right w:val="single" w:sz="4" w:space="0" w:color="auto"/>
+        <w:insideH w:val="single" w:sz="4" w:space="0" w:color="auto"/>
+        <w:insideV w:val="single" w:sz="4" w:space="0" w:color="auto"/>
+      </w:tblBorders>
+    </w:tblPr>
+  </w:style>
+  <w:style w:type="table" w:styleId="GridTable5Dark-Accent1">
+    <w:name w:val="Grid Table 5 Dark Accent 1"/>
+    <w:basedOn w:val="TableNormal"/>
+    <w:uiPriority w:val="50"/>
+    <w:rsid w:val="007B4251"/>
+    <w:pPr>
+      <w:spacing w:after="0" w:line="240" w:lineRule="auto"/>
+    </w:pPr>
+    <w:tblPr>
+      <w:tblStyleRowBandSize w:val="1"/>
+      <w:tblStyleColBandSize w:val="1"/>
+      <w:tblBorders>
+        <w:top w:val="single" w:sz="4" w:space="0" w:color="FFFFFF" w:themeColor="background1"/>
+        <w:left w:val="single" w:sz="4" w:space="0" w:color="FFFFFF" w:themeColor="background1"/>
+        <w:bottom w:val="single" w:sz="4" w:space="0" w:color="FFFFFF" w:themeColor="background1"/>
+        <w:right w:val="single" w:sz="4" w:space="0" w:color="FFFFFF" w:themeColor="background1"/>
+        <w:insideH w:val="single" w:sz="4" w:space="0" w:color="FFFFFF" w:themeColor="background1"/>
+        <w:insideV w:val="single" w:sz="4" w:space="0" w:color="FFFFFF" w:themeColor="background1"/>
+      </w:tblBorders>
+    </w:tblPr>
+    <w:tcPr>
+      <w:shd w:val="clear" w:color="auto" w:fill="DBE5F1" w:themeFill="accent1" w:themeFillTint="33"/>
+    </w:tcPr>
+    <w:tblStylePr w:type="firstRow">
+      <w:rPr>
+        <w:b/>
+        <w:bCs/>
+        <w:color w:val="FFFFFF" w:themeColor="background1"/>
+      </w:rPr>
+      <w:tblPr/>
+      <w:tcPr>
+        <w:tcBorders>
+          <w:top w:val="single" w:sz="4" w:space="0" w:color="FFFFFF" w:themeColor="background1"/>
+          <w:left w:val="single" w:sz="4" w:space="0" w:color="FFFFFF" w:themeColor="background1"/>
+          <w:right w:val="single" w:sz="4" w:space="0" w:color="FFFFFF" w:themeColor="background1"/>
+          <w:insideH w:val="nil"/>
+          <w:insideV w:val="nil"/>
+        </w:tcBorders>
+        <w:shd w:val="clear" w:color="auto" w:fill="4F81BD" w:themeFill="accent1"/>
+      </w:tcPr>
+    </w:tblStylePr>
+    <w:tblStylePr w:type="lastRow">
+      <w:rPr>
+        <w:b/>
+        <w:bCs/>
+        <w:color w:val="FFFFFF" w:themeColor="background1"/>
+      </w:rPr>
+      <w:tblPr/>
+      <w:tcPr>
+        <w:tcBorders>
+          <w:left w:val="single" w:sz="4" w:space="0" w:color="FFFFFF" w:themeColor="background1"/>
+          <w:bottom w:val="single" w:sz="4" w:space="0" w:color="FFFFFF" w:themeColor="background1"/>
+          <w:right w:val="single" w:sz="4" w:space="0" w:color="FFFFFF" w:themeColor="background1"/>
+          <w:insideH w:val="nil"/>
+          <w:insideV w:val="nil"/>
+        </w:tcBorders>
+        <w:shd w:val="clear" w:color="auto" w:fill="4F81BD" w:themeFill="accent1"/>
+      </w:tcPr>
+    </w:tblStylePr>
+    <w:tblStylePr w:type="firstCol">
+      <w:rPr>
+        <w:b/>
+        <w:bCs/>
+        <w:color w:val="FFFFFF" w:themeColor="background1"/>
+      </w:rPr>
+      <w:tblPr/>
+      <w:tcPr>
+        <w:tcBorders>
+          <w:top w:val="single" w:sz="4" w:space="0" w:color="FFFFFF" w:themeColor="background1"/>
+          <w:left w:val="single" w:sz="4" w:space="0" w:color="FFFFFF" w:themeColor="background1"/>
+          <w:bottom w:val="single" w:sz="4" w:space="0" w:color="FFFFFF" w:themeColor="background1"/>
+          <w:insideV w:val="nil"/>
+        </w:tcBorders>
+        <w:shd w:val="clear" w:color="auto" w:fill="4F81BD" w:themeFill="accent1"/>
+      </w:tcPr>
+    </w:tblStylePr>
+    <w:tblStylePr w:type="lastCol">
+      <w:rPr>
+        <w:b/>
+        <w:bCs/>
+        <w:color w:val="FFFFFF" w:themeColor="background1"/>
+      </w:rPr>
+      <w:tblPr/>
+      <w:tcPr>
+        <w:tcBorders>
+          <w:top w:val="single" w:sz="4" w:space="0" w:color="FFFFFF" w:themeColor="background1"/>
+          <w:bottom w:val="single" w:sz="4" w:space="0" w:color="FFFFFF" w:themeColor="background1"/>
+          <w:right w:val="single" w:sz="4" w:space="0" w:color="FFFFFF" w:themeColor="background1"/>
+          <w:insideV w:val="nil"/>
+        </w:tcBorders>
+        <w:shd w:val="clear" w:color="auto" w:fill="4F81BD" w:themeFill="accent1"/>
+      </w:tcPr>
+    </w:tblStylePr>
+    <w:tblStylePr w:type="band1Vert">
+      <w:tblPr/>
+      <w:tcPr>
+        <w:shd w:val="clear" w:color="auto" w:fill="B8CCE4" w:themeFill="accent1" w:themeFillTint="66"/>
+      </w:tcPr>
+    </w:tblStylePr>
+    <w:tblStylePr w:type="band1Horz">
+      <w:tblPr/>
+      <w:tcPr>
+        <w:shd w:val="clear" w:color="auto" w:fill="B8CCE4" w:themeFill="accent1" w:themeFillTint="66"/>
+      </w:tcPr>
+    </w:tblStylePr>
   </w:style>
 </w:styles>
 </file>

</xml_diff>